<commit_message>
docs: integrate official Phase 10 Daily Scrum, Sprint Review, and Retrospective into Word report
</commit_message>
<xml_diff>
--- a/CTI_Sharing_Platform_Phase_01_to_10.docx
+++ b/CTI_Sharing_Platform_Phase_01_to_10.docx
@@ -787,6 +787,10 @@
         <w:gridCol w:w="2770"/>
       </w:tblGrid>
       <w:tr>
+        <w:trPr>
+          <w:tblHeader/>
+          <w:cantSplit/>
+        </w:trPr>
         <w:tc>
           <w:tcPr>
             <w:tcW w:type="dxa" w:w="2592"/>
@@ -867,6 +871,9 @@
         </w:tc>
       </w:tr>
       <w:tr>
+        <w:trPr>
+          <w:cantSplit/>
+        </w:trPr>
         <w:tc>
           <w:tcPr>
             <w:tcW w:type="dxa" w:w="2592"/>
@@ -941,6 +948,9 @@
         </w:tc>
       </w:tr>
       <w:tr>
+        <w:trPr>
+          <w:cantSplit/>
+        </w:trPr>
         <w:tc>
           <w:tcPr>
             <w:tcW w:type="dxa" w:w="2592"/>
@@ -1015,6 +1025,9 @@
         </w:tc>
       </w:tr>
       <w:tr>
+        <w:trPr>
+          <w:cantSplit/>
+        </w:trPr>
         <w:tc>
           <w:tcPr>
             <w:tcW w:type="dxa" w:w="2592"/>
@@ -1089,6 +1102,9 @@
         </w:tc>
       </w:tr>
       <w:tr>
+        <w:trPr>
+          <w:cantSplit/>
+        </w:trPr>
         <w:tc>
           <w:tcPr>
             <w:tcW w:type="dxa" w:w="2592"/>
@@ -1163,6 +1179,9 @@
         </w:tc>
       </w:tr>
       <w:tr>
+        <w:trPr>
+          <w:cantSplit/>
+        </w:trPr>
         <w:tc>
           <w:tcPr>
             <w:tcW w:type="dxa" w:w="2592"/>
@@ -1349,6 +1368,10 @@
         <w:gridCol w:w="2770"/>
       </w:tblGrid>
       <w:tr>
+        <w:trPr>
+          <w:tblHeader/>
+          <w:cantSplit/>
+        </w:trPr>
         <w:tc>
           <w:tcPr>
             <w:tcW w:type="dxa" w:w="2592"/>
@@ -1429,6 +1452,9 @@
         </w:tc>
       </w:tr>
       <w:tr>
+        <w:trPr>
+          <w:cantSplit/>
+        </w:trPr>
         <w:tc>
           <w:tcPr>
             <w:tcW w:type="dxa" w:w="2592"/>
@@ -1503,6 +1529,9 @@
         </w:tc>
       </w:tr>
       <w:tr>
+        <w:trPr>
+          <w:cantSplit/>
+        </w:trPr>
         <w:tc>
           <w:tcPr>
             <w:tcW w:type="dxa" w:w="2592"/>
@@ -1577,6 +1606,9 @@
         </w:tc>
       </w:tr>
       <w:tr>
+        <w:trPr>
+          <w:cantSplit/>
+        </w:trPr>
         <w:tc>
           <w:tcPr>
             <w:tcW w:type="dxa" w:w="2592"/>
@@ -2031,6 +2063,10 @@
         <w:gridCol w:w="4154"/>
       </w:tblGrid>
       <w:tr>
+        <w:trPr>
+          <w:tblHeader/>
+          <w:cantSplit/>
+        </w:trPr>
         <w:tc>
           <w:tcPr>
             <w:tcW w:type="dxa" w:w="2592"/>
@@ -2085,6 +2121,9 @@
         </w:tc>
       </w:tr>
       <w:tr>
+        <w:trPr>
+          <w:cantSplit/>
+        </w:trPr>
         <w:tc>
           <w:tcPr>
             <w:tcW w:type="dxa" w:w="2592"/>
@@ -2135,6 +2174,9 @@
         </w:tc>
       </w:tr>
       <w:tr>
+        <w:trPr>
+          <w:cantSplit/>
+        </w:trPr>
         <w:tc>
           <w:tcPr>
             <w:tcW w:type="dxa" w:w="2592"/>
@@ -2185,6 +2227,9 @@
         </w:tc>
       </w:tr>
       <w:tr>
+        <w:trPr>
+          <w:cantSplit/>
+        </w:trPr>
         <w:tc>
           <w:tcPr>
             <w:tcW w:type="dxa" w:w="2592"/>
@@ -2235,6 +2280,9 @@
         </w:tc>
       </w:tr>
       <w:tr>
+        <w:trPr>
+          <w:cantSplit/>
+        </w:trPr>
         <w:tc>
           <w:tcPr>
             <w:tcW w:type="dxa" w:w="2592"/>
@@ -2285,6 +2333,9 @@
         </w:tc>
       </w:tr>
       <w:tr>
+        <w:trPr>
+          <w:cantSplit/>
+        </w:trPr>
         <w:tc>
           <w:tcPr>
             <w:tcW w:type="dxa" w:w="2592"/>
@@ -2335,6 +2386,9 @@
         </w:tc>
       </w:tr>
       <w:tr>
+        <w:trPr>
+          <w:cantSplit/>
+        </w:trPr>
         <w:tc>
           <w:tcPr>
             <w:tcW w:type="dxa" w:w="2592"/>
@@ -2385,6 +2439,9 @@
         </w:tc>
       </w:tr>
       <w:tr>
+        <w:trPr>
+          <w:cantSplit/>
+        </w:trPr>
         <w:tc>
           <w:tcPr>
             <w:tcW w:type="dxa" w:w="2592"/>
@@ -2435,6 +2492,9 @@
         </w:tc>
       </w:tr>
       <w:tr>
+        <w:trPr>
+          <w:cantSplit/>
+        </w:trPr>
         <w:tc>
           <w:tcPr>
             <w:tcW w:type="dxa" w:w="2592"/>
@@ -2485,6 +2545,9 @@
         </w:tc>
       </w:tr>
       <w:tr>
+        <w:trPr>
+          <w:cantSplit/>
+        </w:trPr>
         <w:tc>
           <w:tcPr>
             <w:tcW w:type="dxa" w:w="2592"/>
@@ -2535,6 +2598,9 @@
         </w:tc>
       </w:tr>
       <w:tr>
+        <w:trPr>
+          <w:cantSplit/>
+        </w:trPr>
         <w:tc>
           <w:tcPr>
             <w:tcW w:type="dxa" w:w="2592"/>
@@ -2585,6 +2651,9 @@
         </w:tc>
       </w:tr>
       <w:tr>
+        <w:trPr>
+          <w:cantSplit/>
+        </w:trPr>
         <w:tc>
           <w:tcPr>
             <w:tcW w:type="dxa" w:w="2592"/>
@@ -2635,6 +2704,9 @@
         </w:tc>
       </w:tr>
       <w:tr>
+        <w:trPr>
+          <w:cantSplit/>
+        </w:trPr>
         <w:tc>
           <w:tcPr>
             <w:tcW w:type="dxa" w:w="2592"/>
@@ -3272,6 +3344,10 @@
         <w:gridCol w:w="2770"/>
       </w:tblGrid>
       <w:tr>
+        <w:trPr>
+          <w:tblHeader/>
+          <w:cantSplit/>
+        </w:trPr>
         <w:tc>
           <w:tcPr>
             <w:tcW w:type="dxa" w:w="2592"/>
@@ -3352,6 +3428,9 @@
         </w:tc>
       </w:tr>
       <w:tr>
+        <w:trPr>
+          <w:cantSplit/>
+        </w:trPr>
         <w:tc>
           <w:tcPr>
             <w:tcW w:type="dxa" w:w="2592"/>
@@ -3426,6 +3505,9 @@
         </w:tc>
       </w:tr>
       <w:tr>
+        <w:trPr>
+          <w:cantSplit/>
+        </w:trPr>
         <w:tc>
           <w:tcPr>
             <w:tcW w:type="dxa" w:w="2592"/>
@@ -3500,6 +3582,9 @@
         </w:tc>
       </w:tr>
       <w:tr>
+        <w:trPr>
+          <w:cantSplit/>
+        </w:trPr>
         <w:tc>
           <w:tcPr>
             <w:tcW w:type="dxa" w:w="2592"/>
@@ -3574,6 +3659,9 @@
         </w:tc>
       </w:tr>
       <w:tr>
+        <w:trPr>
+          <w:cantSplit/>
+        </w:trPr>
         <w:tc>
           <w:tcPr>
             <w:tcW w:type="dxa" w:w="2592"/>
@@ -4092,6 +4180,10 @@
         <w:gridCol w:w="2077"/>
       </w:tblGrid>
       <w:tr>
+        <w:trPr>
+          <w:tblHeader/>
+          <w:cantSplit/>
+        </w:trPr>
         <w:tc>
           <w:tcPr>
             <w:tcW w:type="dxa" w:w="1296"/>
@@ -4198,6 +4290,9 @@
         </w:tc>
       </w:tr>
       <w:tr>
+        <w:trPr>
+          <w:cantSplit/>
+        </w:trPr>
         <w:tc>
           <w:tcPr>
             <w:tcW w:type="dxa" w:w="1296"/>
@@ -4296,6 +4391,9 @@
         </w:tc>
       </w:tr>
       <w:tr>
+        <w:trPr>
+          <w:cantSplit/>
+        </w:trPr>
         <w:tc>
           <w:tcPr>
             <w:tcW w:type="dxa" w:w="1296"/>
@@ -4394,6 +4492,9 @@
         </w:tc>
       </w:tr>
       <w:tr>
+        <w:trPr>
+          <w:cantSplit/>
+        </w:trPr>
         <w:tc>
           <w:tcPr>
             <w:tcW w:type="dxa" w:w="1296"/>
@@ -4492,6 +4593,9 @@
         </w:tc>
       </w:tr>
       <w:tr>
+        <w:trPr>
+          <w:cantSplit/>
+        </w:trPr>
         <w:tc>
           <w:tcPr>
             <w:tcW w:type="dxa" w:w="1296"/>
@@ -4590,6 +4694,9 @@
         </w:tc>
       </w:tr>
       <w:tr>
+        <w:trPr>
+          <w:cantSplit/>
+        </w:trPr>
         <w:tc>
           <w:tcPr>
             <w:tcW w:type="dxa" w:w="1296"/>
@@ -4688,6 +4795,9 @@
         </w:tc>
       </w:tr>
       <w:tr>
+        <w:trPr>
+          <w:cantSplit/>
+        </w:trPr>
         <w:tc>
           <w:tcPr>
             <w:tcW w:type="dxa" w:w="1296"/>
@@ -4837,6 +4947,10 @@
         <w:gridCol w:w="2077"/>
       </w:tblGrid>
       <w:tr>
+        <w:trPr>
+          <w:tblHeader/>
+          <w:cantSplit/>
+        </w:trPr>
         <w:tc>
           <w:tcPr>
             <w:tcW w:type="dxa" w:w="1440"/>
@@ -4943,6 +5057,9 @@
         </w:tc>
       </w:tr>
       <w:tr>
+        <w:trPr>
+          <w:cantSplit/>
+        </w:trPr>
         <w:tc>
           <w:tcPr>
             <w:tcW w:type="dxa" w:w="1440"/>
@@ -5041,6 +5158,9 @@
         </w:tc>
       </w:tr>
       <w:tr>
+        <w:trPr>
+          <w:cantSplit/>
+        </w:trPr>
         <w:tc>
           <w:tcPr>
             <w:tcW w:type="dxa" w:w="1440"/>
@@ -5139,6 +5259,9 @@
         </w:tc>
       </w:tr>
       <w:tr>
+        <w:trPr>
+          <w:cantSplit/>
+        </w:trPr>
         <w:tc>
           <w:tcPr>
             <w:tcW w:type="dxa" w:w="1440"/>
@@ -5237,6 +5360,9 @@
         </w:tc>
       </w:tr>
       <w:tr>
+        <w:trPr>
+          <w:cantSplit/>
+        </w:trPr>
         <w:tc>
           <w:tcPr>
             <w:tcW w:type="dxa" w:w="1440"/>
@@ -5335,6 +5461,9 @@
         </w:tc>
       </w:tr>
       <w:tr>
+        <w:trPr>
+          <w:cantSplit/>
+        </w:trPr>
         <w:tc>
           <w:tcPr>
             <w:tcW w:type="dxa" w:w="1440"/>
@@ -5433,6 +5562,9 @@
         </w:tc>
       </w:tr>
       <w:tr>
+        <w:trPr>
+          <w:cantSplit/>
+        </w:trPr>
         <w:tc>
           <w:tcPr>
             <w:tcW w:type="dxa" w:w="1440"/>
@@ -5531,6 +5663,9 @@
         </w:tc>
       </w:tr>
       <w:tr>
+        <w:trPr>
+          <w:cantSplit/>
+        </w:trPr>
         <w:tc>
           <w:tcPr>
             <w:tcW w:type="dxa" w:w="1440"/>
@@ -5629,6 +5764,9 @@
         </w:tc>
       </w:tr>
       <w:tr>
+        <w:trPr>
+          <w:cantSplit/>
+        </w:trPr>
         <w:tc>
           <w:tcPr>
             <w:tcW w:type="dxa" w:w="1440"/>
@@ -5727,6 +5865,9 @@
         </w:tc>
       </w:tr>
       <w:tr>
+        <w:trPr>
+          <w:cantSplit/>
+        </w:trPr>
         <w:tc>
           <w:tcPr>
             <w:tcW w:type="dxa" w:w="1440"/>
@@ -5825,6 +5966,9 @@
         </w:tc>
       </w:tr>
       <w:tr>
+        <w:trPr>
+          <w:cantSplit/>
+        </w:trPr>
         <w:tc>
           <w:tcPr>
             <w:tcW w:type="dxa" w:w="1440"/>
@@ -5923,6 +6067,9 @@
         </w:tc>
       </w:tr>
       <w:tr>
+        <w:trPr>
+          <w:cantSplit/>
+        </w:trPr>
         <w:tc>
           <w:tcPr>
             <w:tcW w:type="dxa" w:w="1440"/>
@@ -6075,6 +6222,10 @@
         <w:gridCol w:w="2077"/>
       </w:tblGrid>
       <w:tr>
+        <w:trPr>
+          <w:tblHeader/>
+          <w:cantSplit/>
+        </w:trPr>
         <w:tc>
           <w:tcPr>
             <w:tcW w:type="dxa" w:w="2592"/>
@@ -6181,6 +6332,9 @@
         </w:tc>
       </w:tr>
       <w:tr>
+        <w:trPr>
+          <w:cantSplit/>
+        </w:trPr>
         <w:tc>
           <w:tcPr>
             <w:tcW w:type="dxa" w:w="2592"/>
@@ -6279,6 +6433,9 @@
         </w:tc>
       </w:tr>
       <w:tr>
+        <w:trPr>
+          <w:cantSplit/>
+        </w:trPr>
         <w:tc>
           <w:tcPr>
             <w:tcW w:type="dxa" w:w="2592"/>
@@ -6377,6 +6534,9 @@
         </w:tc>
       </w:tr>
       <w:tr>
+        <w:trPr>
+          <w:cantSplit/>
+        </w:trPr>
         <w:tc>
           <w:tcPr>
             <w:tcW w:type="dxa" w:w="2592"/>
@@ -6475,6 +6635,9 @@
         </w:tc>
       </w:tr>
       <w:tr>
+        <w:trPr>
+          <w:cantSplit/>
+        </w:trPr>
         <w:tc>
           <w:tcPr>
             <w:tcW w:type="dxa" w:w="2592"/>
@@ -6695,6 +6858,10 @@
         <w:gridCol w:w="2770"/>
       </w:tblGrid>
       <w:tr>
+        <w:trPr>
+          <w:tblHeader/>
+          <w:cantSplit/>
+        </w:trPr>
         <w:tc>
           <w:tcPr>
             <w:tcW w:type="dxa" w:w="1728"/>
@@ -6775,6 +6942,9 @@
         </w:tc>
       </w:tr>
       <w:tr>
+        <w:trPr>
+          <w:cantSplit/>
+        </w:trPr>
         <w:tc>
           <w:tcPr>
             <w:tcW w:type="dxa" w:w="1728"/>
@@ -6849,6 +7019,9 @@
         </w:tc>
       </w:tr>
       <w:tr>
+        <w:trPr>
+          <w:cantSplit/>
+        </w:trPr>
         <w:tc>
           <w:tcPr>
             <w:tcW w:type="dxa" w:w="1728"/>
@@ -6923,6 +7096,9 @@
         </w:tc>
       </w:tr>
       <w:tr>
+        <w:trPr>
+          <w:cantSplit/>
+        </w:trPr>
         <w:tc>
           <w:tcPr>
             <w:tcW w:type="dxa" w:w="1728"/>
@@ -6997,6 +7173,9 @@
         </w:tc>
       </w:tr>
       <w:tr>
+        <w:trPr>
+          <w:cantSplit/>
+        </w:trPr>
         <w:tc>
           <w:tcPr>
             <w:tcW w:type="dxa" w:w="1728"/>
@@ -7071,6 +7250,9 @@
         </w:tc>
       </w:tr>
       <w:tr>
+        <w:trPr>
+          <w:cantSplit/>
+        </w:trPr>
         <w:tc>
           <w:tcPr>
             <w:tcW w:type="dxa" w:w="1728"/>
@@ -7145,6 +7327,9 @@
         </w:tc>
       </w:tr>
       <w:tr>
+        <w:trPr>
+          <w:cantSplit/>
+        </w:trPr>
         <w:tc>
           <w:tcPr>
             <w:tcW w:type="dxa" w:w="1728"/>
@@ -7219,6 +7404,9 @@
         </w:tc>
       </w:tr>
       <w:tr>
+        <w:trPr>
+          <w:cantSplit/>
+        </w:trPr>
         <w:tc>
           <w:tcPr>
             <w:tcW w:type="dxa" w:w="1728"/>
@@ -7293,6 +7481,9 @@
         </w:tc>
       </w:tr>
       <w:tr>
+        <w:trPr>
+          <w:cantSplit/>
+        </w:trPr>
         <w:tc>
           <w:tcPr>
             <w:tcW w:type="dxa" w:w="1728"/>
@@ -7367,6 +7558,9 @@
         </w:tc>
       </w:tr>
       <w:tr>
+        <w:trPr>
+          <w:cantSplit/>
+        </w:trPr>
         <w:tc>
           <w:tcPr>
             <w:tcW w:type="dxa" w:w="1728"/>
@@ -7441,6 +7635,9 @@
         </w:tc>
       </w:tr>
       <w:tr>
+        <w:trPr>
+          <w:cantSplit/>
+        </w:trPr>
         <w:tc>
           <w:tcPr>
             <w:tcW w:type="dxa" w:w="1728"/>
@@ -7703,6 +7900,10 @@
         <w:gridCol w:w="2077"/>
       </w:tblGrid>
       <w:tr>
+        <w:trPr>
+          <w:tblHeader/>
+          <w:cantSplit/>
+        </w:trPr>
         <w:tc>
           <w:tcPr>
             <w:tcW w:type="dxa" w:w="2304"/>
@@ -7809,6 +8010,9 @@
         </w:tc>
       </w:tr>
       <w:tr>
+        <w:trPr>
+          <w:cantSplit/>
+        </w:trPr>
         <w:tc>
           <w:tcPr>
             <w:tcW w:type="dxa" w:w="2304"/>
@@ -7907,6 +8111,9 @@
         </w:tc>
       </w:tr>
       <w:tr>
+        <w:trPr>
+          <w:cantSplit/>
+        </w:trPr>
         <w:tc>
           <w:tcPr>
             <w:tcW w:type="dxa" w:w="2304"/>
@@ -8005,6 +8212,9 @@
         </w:tc>
       </w:tr>
       <w:tr>
+        <w:trPr>
+          <w:cantSplit/>
+        </w:trPr>
         <w:tc>
           <w:tcPr>
             <w:tcW w:type="dxa" w:w="2304"/>
@@ -8103,6 +8313,9 @@
         </w:tc>
       </w:tr>
       <w:tr>
+        <w:trPr>
+          <w:cantSplit/>
+        </w:trPr>
         <w:tc>
           <w:tcPr>
             <w:tcW w:type="dxa" w:w="2304"/>
@@ -8201,6 +8414,9 @@
         </w:tc>
       </w:tr>
       <w:tr>
+        <w:trPr>
+          <w:cantSplit/>
+        </w:trPr>
         <w:tc>
           <w:tcPr>
             <w:tcW w:type="dxa" w:w="2304"/>
@@ -8299,6 +8515,9 @@
         </w:tc>
       </w:tr>
       <w:tr>
+        <w:trPr>
+          <w:cantSplit/>
+        </w:trPr>
         <w:tc>
           <w:tcPr>
             <w:tcW w:type="dxa" w:w="2304"/>
@@ -8397,6 +8616,9 @@
         </w:tc>
       </w:tr>
       <w:tr>
+        <w:trPr>
+          <w:cantSplit/>
+        </w:trPr>
         <w:tc>
           <w:tcPr>
             <w:tcW w:type="dxa" w:w="2304"/>
@@ -8495,6 +8717,9 @@
         </w:tc>
       </w:tr>
       <w:tr>
+        <w:trPr>
+          <w:cantSplit/>
+        </w:trPr>
         <w:tc>
           <w:tcPr>
             <w:tcW w:type="dxa" w:w="2304"/>
@@ -8593,6 +8818,9 @@
         </w:tc>
       </w:tr>
       <w:tr>
+        <w:trPr>
+          <w:cantSplit/>
+        </w:trPr>
         <w:tc>
           <w:tcPr>
             <w:tcW w:type="dxa" w:w="2304"/>
@@ -8691,6 +8919,9 @@
         </w:tc>
       </w:tr>
       <w:tr>
+        <w:trPr>
+          <w:cantSplit/>
+        </w:trPr>
         <w:tc>
           <w:tcPr>
             <w:tcW w:type="dxa" w:w="2304"/>
@@ -8789,6 +9020,9 @@
         </w:tc>
       </w:tr>
       <w:tr>
+        <w:trPr>
+          <w:cantSplit/>
+        </w:trPr>
         <w:tc>
           <w:tcPr>
             <w:tcW w:type="dxa" w:w="2304"/>
@@ -8887,6 +9121,9 @@
         </w:tc>
       </w:tr>
       <w:tr>
+        <w:trPr>
+          <w:cantSplit/>
+        </w:trPr>
         <w:tc>
           <w:tcPr>
             <w:tcW w:type="dxa" w:w="2304"/>
@@ -8985,6 +9222,9 @@
         </w:tc>
       </w:tr>
       <w:tr>
+        <w:trPr>
+          <w:cantSplit/>
+        </w:trPr>
         <w:tc>
           <w:tcPr>
             <w:tcW w:type="dxa" w:w="2304"/>
@@ -9083,6 +9323,9 @@
         </w:tc>
       </w:tr>
       <w:tr>
+        <w:trPr>
+          <w:cantSplit/>
+        </w:trPr>
         <w:tc>
           <w:tcPr>
             <w:tcW w:type="dxa" w:w="2304"/>
@@ -9181,6 +9424,9 @@
         </w:tc>
       </w:tr>
       <w:tr>
+        <w:trPr>
+          <w:cantSplit/>
+        </w:trPr>
         <w:tc>
           <w:tcPr>
             <w:tcW w:type="dxa" w:w="2304"/>
@@ -9279,6 +9525,9 @@
         </w:tc>
       </w:tr>
       <w:tr>
+        <w:trPr>
+          <w:cantSplit/>
+        </w:trPr>
         <w:tc>
           <w:tcPr>
             <w:tcW w:type="dxa" w:w="2304"/>
@@ -9377,6 +9626,9 @@
         </w:tc>
       </w:tr>
       <w:tr>
+        <w:trPr>
+          <w:cantSplit/>
+        </w:trPr>
         <w:tc>
           <w:tcPr>
             <w:tcW w:type="dxa" w:w="2304"/>
@@ -9475,6 +9727,9 @@
         </w:tc>
       </w:tr>
       <w:tr>
+        <w:trPr>
+          <w:cantSplit/>
+        </w:trPr>
         <w:tc>
           <w:tcPr>
             <w:tcW w:type="dxa" w:w="2304"/>
@@ -9981,6 +10236,10 @@
         <w:gridCol w:w="2077"/>
       </w:tblGrid>
       <w:tr>
+        <w:trPr>
+          <w:tblHeader/>
+          <w:cantSplit/>
+        </w:trPr>
         <w:tc>
           <w:tcPr>
             <w:tcW w:type="dxa" w:w="1440"/>
@@ -10087,6 +10346,9 @@
         </w:tc>
       </w:tr>
       <w:tr>
+        <w:trPr>
+          <w:cantSplit/>
+        </w:trPr>
         <w:tc>
           <w:tcPr>
             <w:tcW w:type="dxa" w:w="1440"/>
@@ -10185,6 +10447,9 @@
         </w:tc>
       </w:tr>
       <w:tr>
+        <w:trPr>
+          <w:cantSplit/>
+        </w:trPr>
         <w:tc>
           <w:tcPr>
             <w:tcW w:type="dxa" w:w="1440"/>
@@ -10283,6 +10548,9 @@
         </w:tc>
       </w:tr>
       <w:tr>
+        <w:trPr>
+          <w:cantSplit/>
+        </w:trPr>
         <w:tc>
           <w:tcPr>
             <w:tcW w:type="dxa" w:w="1440"/>
@@ -10381,6 +10649,9 @@
         </w:tc>
       </w:tr>
       <w:tr>
+        <w:trPr>
+          <w:cantSplit/>
+        </w:trPr>
         <w:tc>
           <w:tcPr>
             <w:tcW w:type="dxa" w:w="1440"/>
@@ -10479,6 +10750,9 @@
         </w:tc>
       </w:tr>
       <w:tr>
+        <w:trPr>
+          <w:cantSplit/>
+        </w:trPr>
         <w:tc>
           <w:tcPr>
             <w:tcW w:type="dxa" w:w="1440"/>
@@ -10577,6 +10851,9 @@
         </w:tc>
       </w:tr>
       <w:tr>
+        <w:trPr>
+          <w:cantSplit/>
+        </w:trPr>
         <w:tc>
           <w:tcPr>
             <w:tcW w:type="dxa" w:w="1440"/>
@@ -10732,6 +11009,10 @@
         <w:gridCol w:w="831"/>
       </w:tblGrid>
       <w:tr>
+        <w:trPr>
+          <w:tblHeader/>
+          <w:cantSplit/>
+        </w:trPr>
         <w:tc>
           <w:tcPr>
             <w:tcW w:type="dxa" w:w="864"/>
@@ -10994,6 +11275,9 @@
         </w:tc>
       </w:tr>
       <w:tr>
+        <w:trPr>
+          <w:cantSplit/>
+        </w:trPr>
         <w:tc>
           <w:tcPr>
             <w:tcW w:type="dxa" w:w="864"/>
@@ -11236,6 +11520,9 @@
         </w:tc>
       </w:tr>
       <w:tr>
+        <w:trPr>
+          <w:cantSplit/>
+        </w:trPr>
         <w:tc>
           <w:tcPr>
             <w:tcW w:type="dxa" w:w="864"/>
@@ -11478,6 +11765,9 @@
         </w:tc>
       </w:tr>
       <w:tr>
+        <w:trPr>
+          <w:cantSplit/>
+        </w:trPr>
         <w:tc>
           <w:tcPr>
             <w:tcW w:type="dxa" w:w="864"/>
@@ -11720,6 +12010,9 @@
         </w:tc>
       </w:tr>
       <w:tr>
+        <w:trPr>
+          <w:cantSplit/>
+        </w:trPr>
         <w:tc>
           <w:tcPr>
             <w:tcW w:type="dxa" w:w="864"/>
@@ -11962,6 +12255,9 @@
         </w:tc>
       </w:tr>
       <w:tr>
+        <w:trPr>
+          <w:cantSplit/>
+        </w:trPr>
         <w:tc>
           <w:tcPr>
             <w:tcW w:type="dxa" w:w="864"/>
@@ -12204,6 +12500,9 @@
         </w:tc>
       </w:tr>
       <w:tr>
+        <w:trPr>
+          <w:cantSplit/>
+        </w:trPr>
         <w:tc>
           <w:tcPr>
             <w:tcW w:type="dxa" w:w="864"/>
@@ -12446,6 +12745,9 @@
         </w:tc>
       </w:tr>
       <w:tr>
+        <w:trPr>
+          <w:cantSplit/>
+        </w:trPr>
         <w:tc>
           <w:tcPr>
             <w:tcW w:type="dxa" w:w="864"/>
@@ -12688,6 +12990,9 @@
         </w:tc>
       </w:tr>
       <w:tr>
+        <w:trPr>
+          <w:cantSplit/>
+        </w:trPr>
         <w:tc>
           <w:tcPr>
             <w:tcW w:type="dxa" w:w="864"/>
@@ -12930,6 +13235,9 @@
         </w:tc>
       </w:tr>
       <w:tr>
+        <w:trPr>
+          <w:cantSplit/>
+        </w:trPr>
         <w:tc>
           <w:tcPr>
             <w:tcW w:type="dxa" w:w="864"/>
@@ -13223,6 +13531,10 @@
         <w:gridCol w:w="2077"/>
       </w:tblGrid>
       <w:tr>
+        <w:trPr>
+          <w:tblHeader/>
+          <w:cantSplit/>
+        </w:trPr>
         <w:tc>
           <w:tcPr>
             <w:tcW w:type="dxa" w:w="1152"/>
@@ -13329,6 +13641,9 @@
         </w:tc>
       </w:tr>
       <w:tr>
+        <w:trPr>
+          <w:cantSplit/>
+        </w:trPr>
         <w:tc>
           <w:tcPr>
             <w:tcW w:type="dxa" w:w="1152"/>
@@ -13427,6 +13742,9 @@
         </w:tc>
       </w:tr>
       <w:tr>
+        <w:trPr>
+          <w:cantSplit/>
+        </w:trPr>
         <w:tc>
           <w:tcPr>
             <w:tcW w:type="dxa" w:w="1152"/>
@@ -13525,6 +13843,9 @@
         </w:tc>
       </w:tr>
       <w:tr>
+        <w:trPr>
+          <w:cantSplit/>
+        </w:trPr>
         <w:tc>
           <w:tcPr>
             <w:tcW w:type="dxa" w:w="1152"/>
@@ -13623,6 +13944,9 @@
         </w:tc>
       </w:tr>
       <w:tr>
+        <w:trPr>
+          <w:cantSplit/>
+        </w:trPr>
         <w:tc>
           <w:tcPr>
             <w:tcW w:type="dxa" w:w="1152"/>
@@ -13721,6 +14045,9 @@
         </w:tc>
       </w:tr>
       <w:tr>
+        <w:trPr>
+          <w:cantSplit/>
+        </w:trPr>
         <w:tc>
           <w:tcPr>
             <w:tcW w:type="dxa" w:w="1152"/>
@@ -13819,6 +14146,9 @@
         </w:tc>
       </w:tr>
       <w:tr>
+        <w:trPr>
+          <w:cantSplit/>
+        </w:trPr>
         <w:tc>
           <w:tcPr>
             <w:tcW w:type="dxa" w:w="1152"/>
@@ -13917,6 +14247,9 @@
         </w:tc>
       </w:tr>
       <w:tr>
+        <w:trPr>
+          <w:cantSplit/>
+        </w:trPr>
         <w:tc>
           <w:tcPr>
             <w:tcW w:type="dxa" w:w="1152"/>
@@ -14015,6 +14348,9 @@
         </w:tc>
       </w:tr>
       <w:tr>
+        <w:trPr>
+          <w:cantSplit/>
+        </w:trPr>
         <w:tc>
           <w:tcPr>
             <w:tcW w:type="dxa" w:w="1152"/>
@@ -14113,6 +14449,9 @@
         </w:tc>
       </w:tr>
       <w:tr>
+        <w:trPr>
+          <w:cantSplit/>
+        </w:trPr>
         <w:tc>
           <w:tcPr>
             <w:tcW w:type="dxa" w:w="1152"/>
@@ -14673,6 +15012,10 @@
         <w:gridCol w:w="4154"/>
       </w:tblGrid>
       <w:tr>
+        <w:trPr>
+          <w:tblHeader/>
+          <w:cantSplit/>
+        </w:trPr>
         <w:tc>
           <w:tcPr>
             <w:tcW w:type="dxa" w:w="2880"/>
@@ -14727,6 +15070,9 @@
         </w:tc>
       </w:tr>
       <w:tr>
+        <w:trPr>
+          <w:cantSplit/>
+        </w:trPr>
         <w:tc>
           <w:tcPr>
             <w:tcW w:type="dxa" w:w="2880"/>
@@ -14777,6 +15123,9 @@
         </w:tc>
       </w:tr>
       <w:tr>
+        <w:trPr>
+          <w:cantSplit/>
+        </w:trPr>
         <w:tc>
           <w:tcPr>
             <w:tcW w:type="dxa" w:w="2880"/>
@@ -14827,6 +15176,9 @@
         </w:tc>
       </w:tr>
       <w:tr>
+        <w:trPr>
+          <w:cantSplit/>
+        </w:trPr>
         <w:tc>
           <w:tcPr>
             <w:tcW w:type="dxa" w:w="2880"/>
@@ -14877,6 +15229,9 @@
         </w:tc>
       </w:tr>
       <w:tr>
+        <w:trPr>
+          <w:cantSplit/>
+        </w:trPr>
         <w:tc>
           <w:tcPr>
             <w:tcW w:type="dxa" w:w="2880"/>
@@ -14927,6 +15282,9 @@
         </w:tc>
       </w:tr>
       <w:tr>
+        <w:trPr>
+          <w:cantSplit/>
+        </w:trPr>
         <w:tc>
           <w:tcPr>
             <w:tcW w:type="dxa" w:w="2880"/>
@@ -14989,6 +15347,9 @@
         </w:tc>
       </w:tr>
       <w:tr>
+        <w:trPr>
+          <w:cantSplit/>
+        </w:trPr>
         <w:tc>
           <w:tcPr>
             <w:tcW w:type="dxa" w:w="2880"/>
@@ -15075,6 +15436,10 @@
         <w:gridCol w:w="4154"/>
       </w:tblGrid>
       <w:tr>
+        <w:trPr>
+          <w:tblHeader/>
+          <w:cantSplit/>
+        </w:trPr>
         <w:tc>
           <w:tcPr>
             <w:tcW w:type="dxa" w:w="2880"/>
@@ -15129,6 +15494,9 @@
         </w:tc>
       </w:tr>
       <w:tr>
+        <w:trPr>
+          <w:cantSplit/>
+        </w:trPr>
         <w:tc>
           <w:tcPr>
             <w:tcW w:type="dxa" w:w="2880"/>
@@ -15179,6 +15547,9 @@
         </w:tc>
       </w:tr>
       <w:tr>
+        <w:trPr>
+          <w:cantSplit/>
+        </w:trPr>
         <w:tc>
           <w:tcPr>
             <w:tcW w:type="dxa" w:w="2880"/>
@@ -15229,6 +15600,9 @@
         </w:tc>
       </w:tr>
       <w:tr>
+        <w:trPr>
+          <w:cantSplit/>
+        </w:trPr>
         <w:tc>
           <w:tcPr>
             <w:tcW w:type="dxa" w:w="2880"/>
@@ -15279,6 +15653,9 @@
         </w:tc>
       </w:tr>
       <w:tr>
+        <w:trPr>
+          <w:cantSplit/>
+        </w:trPr>
         <w:tc>
           <w:tcPr>
             <w:tcW w:type="dxa" w:w="2880"/>
@@ -15329,6 +15706,9 @@
         </w:tc>
       </w:tr>
       <w:tr>
+        <w:trPr>
+          <w:cantSplit/>
+        </w:trPr>
         <w:tc>
           <w:tcPr>
             <w:tcW w:type="dxa" w:w="2880"/>
@@ -15393,6 +15773,9 @@
         </w:tc>
       </w:tr>
       <w:tr>
+        <w:trPr>
+          <w:cantSplit/>
+        </w:trPr>
         <w:tc>
           <w:tcPr>
             <w:tcW w:type="dxa" w:w="2880"/>
@@ -16093,6 +16476,10 @@
         <w:gridCol w:w="2770"/>
       </w:tblGrid>
       <w:tr>
+        <w:trPr>
+          <w:tblHeader/>
+          <w:cantSplit/>
+        </w:trPr>
         <w:tc>
           <w:tcPr>
             <w:tcW w:type="dxa" w:w="2160"/>
@@ -16173,6 +16560,9 @@
         </w:tc>
       </w:tr>
       <w:tr>
+        <w:trPr>
+          <w:cantSplit/>
+        </w:trPr>
         <w:tc>
           <w:tcPr>
             <w:tcW w:type="dxa" w:w="2160"/>
@@ -16247,6 +16637,9 @@
         </w:tc>
       </w:tr>
       <w:tr>
+        <w:trPr>
+          <w:cantSplit/>
+        </w:trPr>
         <w:tc>
           <w:tcPr>
             <w:tcW w:type="dxa" w:w="2160"/>
@@ -16321,6 +16714,9 @@
         </w:tc>
       </w:tr>
       <w:tr>
+        <w:trPr>
+          <w:cantSplit/>
+        </w:trPr>
         <w:tc>
           <w:tcPr>
             <w:tcW w:type="dxa" w:w="2160"/>
@@ -16395,6 +16791,9 @@
         </w:tc>
       </w:tr>
       <w:tr>
+        <w:trPr>
+          <w:cantSplit/>
+        </w:trPr>
         <w:tc>
           <w:tcPr>
             <w:tcW w:type="dxa" w:w="2160"/>
@@ -16469,6 +16868,9 @@
         </w:tc>
       </w:tr>
       <w:tr>
+        <w:trPr>
+          <w:cantSplit/>
+        </w:trPr>
         <w:tc>
           <w:tcPr>
             <w:tcW w:type="dxa" w:w="2160"/>
@@ -16543,6 +16945,9 @@
         </w:tc>
       </w:tr>
       <w:tr>
+        <w:trPr>
+          <w:cantSplit/>
+        </w:trPr>
         <w:tc>
           <w:tcPr>
             <w:tcW w:type="dxa" w:w="2160"/>
@@ -17049,6 +17454,10 @@
         <w:gridCol w:w="2770"/>
       </w:tblGrid>
       <w:tr>
+        <w:trPr>
+          <w:tblHeader/>
+          <w:cantSplit/>
+        </w:trPr>
         <w:tc>
           <w:tcPr>
             <w:tcW w:type="dxa" w:w="864"/>
@@ -17129,6 +17538,9 @@
         </w:tc>
       </w:tr>
       <w:tr>
+        <w:trPr>
+          <w:cantSplit/>
+        </w:trPr>
         <w:tc>
           <w:tcPr>
             <w:tcW w:type="dxa" w:w="864"/>
@@ -17203,6 +17615,9 @@
         </w:tc>
       </w:tr>
       <w:tr>
+        <w:trPr>
+          <w:cantSplit/>
+        </w:trPr>
         <w:tc>
           <w:tcPr>
             <w:tcW w:type="dxa" w:w="864"/>
@@ -17277,6 +17692,9 @@
         </w:tc>
       </w:tr>
       <w:tr>
+        <w:trPr>
+          <w:cantSplit/>
+        </w:trPr>
         <w:tc>
           <w:tcPr>
             <w:tcW w:type="dxa" w:w="864"/>
@@ -17351,6 +17769,9 @@
         </w:tc>
       </w:tr>
       <w:tr>
+        <w:trPr>
+          <w:cantSplit/>
+        </w:trPr>
         <w:tc>
           <w:tcPr>
             <w:tcW w:type="dxa" w:w="864"/>
@@ -17425,6 +17846,9 @@
         </w:tc>
       </w:tr>
       <w:tr>
+        <w:trPr>
+          <w:cantSplit/>
+        </w:trPr>
         <w:tc>
           <w:tcPr>
             <w:tcW w:type="dxa" w:w="864"/>
@@ -17499,6 +17923,9 @@
         </w:tc>
       </w:tr>
       <w:tr>
+        <w:trPr>
+          <w:cantSplit/>
+        </w:trPr>
         <w:tc>
           <w:tcPr>
             <w:tcW w:type="dxa" w:w="864"/>
@@ -17573,6 +18000,9 @@
         </w:tc>
       </w:tr>
       <w:tr>
+        <w:trPr>
+          <w:cantSplit/>
+        </w:trPr>
         <w:tc>
           <w:tcPr>
             <w:tcW w:type="dxa" w:w="864"/>
@@ -17647,6 +18077,9 @@
         </w:tc>
       </w:tr>
       <w:tr>
+        <w:trPr>
+          <w:cantSplit/>
+        </w:trPr>
         <w:tc>
           <w:tcPr>
             <w:tcW w:type="dxa" w:w="864"/>
@@ -17795,6 +18228,10 @@
         <w:gridCol w:w="1385"/>
       </w:tblGrid>
       <w:tr>
+        <w:trPr>
+          <w:tblHeader/>
+          <w:cantSplit/>
+        </w:trPr>
         <w:tc>
           <w:tcPr>
             <w:tcW w:type="dxa" w:w="864"/>
@@ -17953,6 +18390,9 @@
         </w:tc>
       </w:tr>
       <w:tr>
+        <w:trPr>
+          <w:cantSplit/>
+        </w:trPr>
         <w:tc>
           <w:tcPr>
             <w:tcW w:type="dxa" w:w="864"/>
@@ -18099,6 +18539,9 @@
         </w:tc>
       </w:tr>
       <w:tr>
+        <w:trPr>
+          <w:cantSplit/>
+        </w:trPr>
         <w:tc>
           <w:tcPr>
             <w:tcW w:type="dxa" w:w="864"/>
@@ -18245,6 +18688,9 @@
         </w:tc>
       </w:tr>
       <w:tr>
+        <w:trPr>
+          <w:cantSplit/>
+        </w:trPr>
         <w:tc>
           <w:tcPr>
             <w:tcW w:type="dxa" w:w="864"/>
@@ -18391,6 +18837,9 @@
         </w:tc>
       </w:tr>
       <w:tr>
+        <w:trPr>
+          <w:cantSplit/>
+        </w:trPr>
         <w:tc>
           <w:tcPr>
             <w:tcW w:type="dxa" w:w="864"/>
@@ -18537,6 +18986,9 @@
         </w:tc>
       </w:tr>
       <w:tr>
+        <w:trPr>
+          <w:cantSplit/>
+        </w:trPr>
         <w:tc>
           <w:tcPr>
             <w:tcW w:type="dxa" w:w="864"/>
@@ -18683,6 +19135,9 @@
         </w:tc>
       </w:tr>
       <w:tr>
+        <w:trPr>
+          <w:cantSplit/>
+        </w:trPr>
         <w:tc>
           <w:tcPr>
             <w:tcW w:type="dxa" w:w="864"/>
@@ -18829,6 +19284,9 @@
         </w:tc>
       </w:tr>
       <w:tr>
+        <w:trPr>
+          <w:cantSplit/>
+        </w:trPr>
         <w:tc>
           <w:tcPr>
             <w:tcW w:type="dxa" w:w="864"/>
@@ -18975,6 +19433,9 @@
         </w:tc>
       </w:tr>
       <w:tr>
+        <w:trPr>
+          <w:cantSplit/>
+        </w:trPr>
         <w:tc>
           <w:tcPr>
             <w:tcW w:type="dxa" w:w="864"/>
@@ -19121,6 +19582,9 @@
         </w:tc>
       </w:tr>
       <w:tr>
+        <w:trPr>
+          <w:cantSplit/>
+        </w:trPr>
         <w:tc>
           <w:tcPr>
             <w:tcW w:type="dxa" w:w="864"/>
@@ -19308,6 +19772,10 @@
         <w:gridCol w:w="1187"/>
       </w:tblGrid>
       <w:tr>
+        <w:trPr>
+          <w:tblHeader/>
+          <w:cantSplit/>
+        </w:trPr>
         <w:tc>
           <w:tcPr>
             <w:tcW w:type="dxa" w:w="720"/>
@@ -19492,6 +19960,9 @@
         </w:tc>
       </w:tr>
       <w:tr>
+        <w:trPr>
+          <w:cantSplit/>
+        </w:trPr>
         <w:tc>
           <w:tcPr>
             <w:tcW w:type="dxa" w:w="720"/>
@@ -19662,6 +20133,9 @@
         </w:tc>
       </w:tr>
       <w:tr>
+        <w:trPr>
+          <w:cantSplit/>
+        </w:trPr>
         <w:tc>
           <w:tcPr>
             <w:tcW w:type="dxa" w:w="720"/>
@@ -19832,6 +20306,9 @@
         </w:tc>
       </w:tr>
       <w:tr>
+        <w:trPr>
+          <w:cantSplit/>
+        </w:trPr>
         <w:tc>
           <w:tcPr>
             <w:tcW w:type="dxa" w:w="720"/>
@@ -20002,6 +20479,9 @@
         </w:tc>
       </w:tr>
       <w:tr>
+        <w:trPr>
+          <w:cantSplit/>
+        </w:trPr>
         <w:tc>
           <w:tcPr>
             <w:tcW w:type="dxa" w:w="720"/>
@@ -20172,6 +20652,9 @@
         </w:tc>
       </w:tr>
       <w:tr>
+        <w:trPr>
+          <w:cantSplit/>
+        </w:trPr>
         <w:tc>
           <w:tcPr>
             <w:tcW w:type="dxa" w:w="720"/>
@@ -20342,6 +20825,9 @@
         </w:tc>
       </w:tr>
       <w:tr>
+        <w:trPr>
+          <w:cantSplit/>
+        </w:trPr>
         <w:tc>
           <w:tcPr>
             <w:tcW w:type="dxa" w:w="720"/>
@@ -20512,6 +20998,9 @@
         </w:tc>
       </w:tr>
       <w:tr>
+        <w:trPr>
+          <w:cantSplit/>
+        </w:trPr>
         <w:tc>
           <w:tcPr>
             <w:tcW w:type="dxa" w:w="720"/>
@@ -20682,6 +21171,9 @@
         </w:tc>
       </w:tr>
       <w:tr>
+        <w:trPr>
+          <w:cantSplit/>
+        </w:trPr>
         <w:tc>
           <w:tcPr>
             <w:tcW w:type="dxa" w:w="720"/>
@@ -20852,6 +21344,9 @@
         </w:tc>
       </w:tr>
       <w:tr>
+        <w:trPr>
+          <w:cantSplit/>
+        </w:trPr>
         <w:tc>
           <w:tcPr>
             <w:tcW w:type="dxa" w:w="720"/>
@@ -21022,6 +21517,9 @@
         </w:tc>
       </w:tr>
       <w:tr>
+        <w:trPr>
+          <w:cantSplit/>
+        </w:trPr>
         <w:tc>
           <w:tcPr>
             <w:tcW w:type="dxa" w:w="720"/>
@@ -21329,6 +21827,10 @@
         <w:gridCol w:w="1662"/>
       </w:tblGrid>
       <w:tr>
+        <w:trPr>
+          <w:tblHeader/>
+          <w:cantSplit/>
+        </w:trPr>
         <w:tc>
           <w:tcPr>
             <w:tcW w:type="dxa" w:w="864"/>
@@ -21461,6 +21963,9 @@
         </w:tc>
       </w:tr>
       <w:tr>
+        <w:trPr>
+          <w:cantSplit/>
+        </w:trPr>
         <w:tc>
           <w:tcPr>
             <w:tcW w:type="dxa" w:w="864"/>
@@ -21583,6 +22088,9 @@
         </w:tc>
       </w:tr>
       <w:tr>
+        <w:trPr>
+          <w:cantSplit/>
+        </w:trPr>
         <w:tc>
           <w:tcPr>
             <w:tcW w:type="dxa" w:w="864"/>
@@ -21705,6 +22213,9 @@
         </w:tc>
       </w:tr>
       <w:tr>
+        <w:trPr>
+          <w:cantSplit/>
+        </w:trPr>
         <w:tc>
           <w:tcPr>
             <w:tcW w:type="dxa" w:w="864"/>
@@ -21827,6 +22338,9 @@
         </w:tc>
       </w:tr>
       <w:tr>
+        <w:trPr>
+          <w:cantSplit/>
+        </w:trPr>
         <w:tc>
           <w:tcPr>
             <w:tcW w:type="dxa" w:w="864"/>
@@ -21949,6 +22463,9 @@
         </w:tc>
       </w:tr>
       <w:tr>
+        <w:trPr>
+          <w:cantSplit/>
+        </w:trPr>
         <w:tc>
           <w:tcPr>
             <w:tcW w:type="dxa" w:w="864"/>
@@ -22071,6 +22588,9 @@
         </w:tc>
       </w:tr>
       <w:tr>
+        <w:trPr>
+          <w:cantSplit/>
+        </w:trPr>
         <w:tc>
           <w:tcPr>
             <w:tcW w:type="dxa" w:w="864"/>
@@ -22480,6 +23000,10 @@
         <w:gridCol w:w="1385"/>
       </w:tblGrid>
       <w:tr>
+        <w:trPr>
+          <w:tblHeader/>
+          <w:cantSplit/>
+        </w:trPr>
         <w:tc>
           <w:tcPr>
             <w:tcW w:type="dxa" w:w="2160"/>
@@ -22638,6 +23162,9 @@
         </w:tc>
       </w:tr>
       <w:tr>
+        <w:trPr>
+          <w:cantSplit/>
+        </w:trPr>
         <w:tc>
           <w:tcPr>
             <w:tcW w:type="dxa" w:w="2160"/>
@@ -22784,6 +23311,9 @@
         </w:tc>
       </w:tr>
       <w:tr>
+        <w:trPr>
+          <w:cantSplit/>
+        </w:trPr>
         <w:tc>
           <w:tcPr>
             <w:tcW w:type="dxa" w:w="2160"/>
@@ -22930,6 +23460,9 @@
         </w:tc>
       </w:tr>
       <w:tr>
+        <w:trPr>
+          <w:cantSplit/>
+        </w:trPr>
         <w:tc>
           <w:tcPr>
             <w:tcW w:type="dxa" w:w="2160"/>
@@ -23076,6 +23609,9 @@
         </w:tc>
       </w:tr>
       <w:tr>
+        <w:trPr>
+          <w:cantSplit/>
+        </w:trPr>
         <w:tc>
           <w:tcPr>
             <w:tcW w:type="dxa" w:w="2160"/>
@@ -23222,6 +23758,9 @@
         </w:tc>
       </w:tr>
       <w:tr>
+        <w:trPr>
+          <w:cantSplit/>
+        </w:trPr>
         <w:tc>
           <w:tcPr>
             <w:tcW w:type="dxa" w:w="2160"/>
@@ -23758,6 +24297,10 @@
         <w:gridCol w:w="1039"/>
       </w:tblGrid>
       <w:tr>
+        <w:trPr>
+          <w:tblHeader/>
+          <w:cantSplit/>
+        </w:trPr>
         <w:tc>
           <w:tcPr>
             <w:tcW w:type="dxa" w:w="864"/>
@@ -23968,6 +24511,9 @@
         </w:tc>
       </w:tr>
       <w:tr>
+        <w:trPr>
+          <w:cantSplit/>
+        </w:trPr>
         <w:tc>
           <w:tcPr>
             <w:tcW w:type="dxa" w:w="864"/>
@@ -24162,6 +24708,9 @@
         </w:tc>
       </w:tr>
       <w:tr>
+        <w:trPr>
+          <w:cantSplit/>
+        </w:trPr>
         <w:tc>
           <w:tcPr>
             <w:tcW w:type="dxa" w:w="864"/>
@@ -24356,6 +24905,9 @@
         </w:tc>
       </w:tr>
       <w:tr>
+        <w:trPr>
+          <w:cantSplit/>
+        </w:trPr>
         <w:tc>
           <w:tcPr>
             <w:tcW w:type="dxa" w:w="864"/>
@@ -24550,6 +25102,9 @@
         </w:tc>
       </w:tr>
       <w:tr>
+        <w:trPr>
+          <w:cantSplit/>
+        </w:trPr>
         <w:tc>
           <w:tcPr>
             <w:tcW w:type="dxa" w:w="864"/>
@@ -24744,6 +25299,9 @@
         </w:tc>
       </w:tr>
       <w:tr>
+        <w:trPr>
+          <w:cantSplit/>
+        </w:trPr>
         <w:tc>
           <w:tcPr>
             <w:tcW w:type="dxa" w:w="864"/>
@@ -24938,6 +25496,9 @@
         </w:tc>
       </w:tr>
       <w:tr>
+        <w:trPr>
+          <w:cantSplit/>
+        </w:trPr>
         <w:tc>
           <w:tcPr>
             <w:tcW w:type="dxa" w:w="864"/>
@@ -25132,6 +25693,9 @@
         </w:tc>
       </w:tr>
       <w:tr>
+        <w:trPr>
+          <w:cantSplit/>
+        </w:trPr>
         <w:tc>
           <w:tcPr>
             <w:tcW w:type="dxa" w:w="864"/>
@@ -25326,6 +25890,9 @@
         </w:tc>
       </w:tr>
       <w:tr>
+        <w:trPr>
+          <w:cantSplit/>
+        </w:trPr>
         <w:tc>
           <w:tcPr>
             <w:tcW w:type="dxa" w:w="864"/>
@@ -25520,6 +26087,9 @@
         </w:tc>
       </w:tr>
       <w:tr>
+        <w:trPr>
+          <w:cantSplit/>
+        </w:trPr>
         <w:tc>
           <w:tcPr>
             <w:tcW w:type="dxa" w:w="864"/>
@@ -25714,6 +26284,9 @@
         </w:tc>
       </w:tr>
       <w:tr>
+        <w:trPr>
+          <w:cantSplit/>
+        </w:trPr>
         <w:tc>
           <w:tcPr>
             <w:tcW w:type="dxa" w:w="864"/>
@@ -26088,101 +26661,76 @@
           <w:color w:val="000000"/>
           <w:sz w:val="26"/>
         </w:rPr>
-        <w:t>11.1 Daily Scrum Records (Sample Operational Standups)</w:t>
+        <w:t>10.1 Sprint Board</w:t>
       </w:r>
     </w:p>
     <w:p>
       <w:pPr>
-        <w:pStyle w:val="ListBullet"/>
-        <w:spacing w:after="60" w:line="276" w:lineRule="auto"/>
+        <w:spacing w:after="80" w:line="276" w:lineRule="auto"/>
       </w:pPr>
-      <w:r>
-        <w:rPr>
-          <w:rFonts w:ascii="Calibri" w:hAnsi="Calibri"/>
-          <w:b/>
-          <w:color w:val="000000"/>
-          <w:sz w:val="20"/>
-        </w:rPr>
-        <w:t xml:space="preserve">Standup 1: </w:t>
-      </w:r>
       <w:r>
         <w:rPr>
           <w:rFonts w:ascii="Calibri" w:hAnsi="Calibri"/>
           <w:color w:val="000000"/>
           <w:sz w:val="20"/>
         </w:rPr>
-        <w:t xml:space="preserve"> Sprint 1, Day 3: Completed Bcrypt password salting and RFC 6238 TOTP generation. Identified need for clock drift tolerance (+/-30s) to accommodate mobile authenticators. Next: Build authGuard JWT verification middleware.</w:t>
+        <w:t>The CTI Sharing Platform was developed under a two-week sprint cadence following empirical Scrum practices. Work items progressed across the four-state workflow: TODO -&gt; IN PROGRESS -&gt; TESTING -&gt; DONE. All 10 committed user stories (CTI-1 through CTI-12 / CTI-101 through CTI-110) reached the DONE state, satisfying all acceptance criteria and passing all 53 automated unit and integration tests.</w:t>
       </w:r>
     </w:p>
-    <w:p>
-      <w:pPr>
-        <w:pStyle w:val="ListBullet"/>
-        <w:spacing w:after="60" w:line="276" w:lineRule="auto"/>
-      </w:pPr>
-      <w:r>
-        <w:rPr>
-          <w:rFonts w:ascii="Calibri" w:hAnsi="Calibri"/>
-          <w:b/>
-          <w:color w:val="000000"/>
-          <w:sz w:val="20"/>
-        </w:rPr>
-        <w:t xml:space="preserve">Standup 2: </w:t>
-      </w:r>
-      <w:r>
-        <w:rPr>
-          <w:rFonts w:ascii="Calibri" w:hAnsi="Calibri"/>
-          <w:color w:val="000000"/>
-          <w:sz w:val="20"/>
-        </w:rPr>
-        <w:t xml:space="preserve"> Sprint 1, Day 7: Implemented Strategy Pattern IoC validator. Overcame ReDoS risk by replacing unanchored regex with bounded, non-backtracking patterns (&lt;253 chars). Next: Threat report Markdown Stored-XSS sanitizer.</w:t>
-      </w:r>
-    </w:p>
-    <w:p>
-      <w:pPr>
-        <w:pStyle w:val="ListBullet"/>
-        <w:spacing w:after="60" w:line="276" w:lineRule="auto"/>
-      </w:pPr>
-      <w:r>
-        <w:rPr>
-          <w:rFonts w:ascii="Calibri" w:hAnsi="Calibri"/>
-          <w:b/>
-          <w:color w:val="000000"/>
-          <w:sz w:val="20"/>
-        </w:rPr>
-        <w:t xml:space="preserve">Standup 3: </w:t>
-      </w:r>
-      <w:r>
-        <w:rPr>
-          <w:rFonts w:ascii="Calibri" w:hAnsi="Calibri"/>
-          <w:color w:val="000000"/>
-          <w:sz w:val="20"/>
-        </w:rPr>
-        <w:t xml:space="preserve"> Sprint 2, Day 4: Implemented canAccessTLP authorization policy function. Resolved edge case where consumers from the submitting org were mistakenly denied TLP:AMBER. Next: Server-side STIX 2.1 egress filtering.</w:t>
-      </w:r>
-    </w:p>
-    <w:p>
-      <w:pPr>
-        <w:pStyle w:val="ListBullet"/>
-        <w:spacing w:after="60" w:line="276" w:lineRule="auto"/>
-      </w:pPr>
-      <w:r>
-        <w:rPr>
-          <w:rFonts w:ascii="Calibri" w:hAnsi="Calibri"/>
-          <w:b/>
-          <w:color w:val="000000"/>
-          <w:sz w:val="20"/>
-        </w:rPr>
-        <w:t xml:space="preserve">Standup 4: </w:t>
-      </w:r>
-      <w:r>
-        <w:rPr>
-          <w:rFonts w:ascii="Calibri" w:hAnsi="Calibri"/>
-          <w:color w:val="000000"/>
-          <w:sz w:val="20"/>
-        </w:rPr>
-        <w:t xml:space="preserve"> Sprint 2, Day 8: Integrated Tamper-Evident SHA-256 Hash-Chained Audit Log. Resolved async concurrency issue using in-process Promise serialization queue. Next: Prometheus metrics and verification API.</w:t>
-      </w:r>
-    </w:p>
+    <w:tbl>
+      <w:tblPr>
+        <w:tblW w:type="auto" w:w="0"/>
+        <w:jc w:val="center"/>
+        <w:tblLook w:firstColumn="1" w:firstRow="1" w:lastColumn="0" w:lastRow="0" w:noHBand="0" w:noVBand="1" w:val="04A0"/>
+      </w:tblPr>
+      <w:tblGrid>
+        <w:gridCol w:w="8309"/>
+      </w:tblGrid>
+      <w:tr>
+        <w:tc>
+          <w:tcPr>
+            <w:tcW w:type="dxa" w:w="8309"/>
+            <w:tcMar>
+              <w:top w:w="140" w:type="dxa"/>
+              <w:bottom w:w="140" w:type="dxa"/>
+              <w:left w:w="200" w:type="dxa"/>
+              <w:right w:w="200" w:type="dxa"/>
+            </w:tcMar>
+            <w:tcBorders>
+              <w:top w:val="single" w:sz="4" w:space="0" w:color="auto"/>
+              <w:left w:val="single" w:sz="18" w:space="0" w:color="auto"/>
+              <w:bottom w:val="single" w:sz="4" w:space="0" w:color="auto"/>
+              <w:right w:val="single" w:sz="4" w:space="0" w:color="auto"/>
+            </w:tcBorders>
+          </w:tcPr>
+          <w:p>
+            <w:pPr>
+              <w:spacing w:after="40"/>
+              <w:jc w:val="center"/>
+            </w:pPr>
+            <w:r>
+              <w:rPr>
+                <w:rFonts w:ascii="Calibri" w:hAnsi="Calibri"/>
+                <w:b/>
+                <w:sz w:val="19"/>
+              </w:rPr>
+              <w:t>[INSERT ACTUAL JIRA METRIC SCREENSHOT: SPRINT BURNDOWN &amp; VELOCITY CHART]</w:t>
+              <w:br/>
+            </w:r>
+            <w:r>
+              <w:rPr>
+                <w:rFonts w:ascii="Calibri" w:hAnsi="Calibri"/>
+                <w:i/>
+                <w:sz w:val="17"/>
+              </w:rPr>
+              <w:t>Captures the completed Jira Scrum board (all stories in DONE column) and the actual Sprint Burndown showing 0 remaining SP.</w:t>
+              <w:br/>
+            </w:r>
+          </w:p>
+        </w:tc>
+      </w:tr>
+    </w:tbl>
+    <w:p/>
     <w:p>
       <w:pPr>
         <w:pStyle w:val="Heading2"/>
@@ -26196,7 +26744,1191 @@
           <w:color w:val="000000"/>
           <w:sz w:val="26"/>
         </w:rPr>
-        <w:t>11.2 Sprint Burndown Data &amp; Chart Table</w:t>
+        <w:t>10.2 Daily Scrum</w:t>
+      </w:r>
+    </w:p>
+    <w:p>
+      <w:pPr>
+        <w:spacing w:after="80" w:line="276" w:lineRule="auto"/>
+      </w:pPr>
+      <w:r>
+        <w:rPr>
+          <w:rFonts w:ascii="Calibri" w:hAnsi="Calibri"/>
+          <w:color w:val="000000"/>
+          <w:sz w:val="20"/>
+        </w:rPr>
+        <w:t>The operational Daily Scrum was conducted across the 10-day sprint cycle to synchronize engineering progress, validate daily milestones, and eliminate impediments. The complete 10-day log is documented in the table below:</w:t>
+      </w:r>
+    </w:p>
+    <w:tbl>
+      <w:tblPr>
+        <w:tblW w:type="auto" w:w="0"/>
+        <w:jc w:val="center"/>
+        <w:tblLook w:firstColumn="1" w:firstRow="1" w:lastColumn="0" w:lastRow="0" w:noHBand="0" w:noVBand="1" w:val="04A0"/>
+        <w:tblBorders>
+          <w:top w:val="single" w:sz="4" w:space="0" w:color="000000"/>
+          <w:bottom w:val="single" w:sz="4" w:space="0" w:color="000000"/>
+          <w:left w:val="none" w:sz="0" w:space="0" w:color="auto"/>
+          <w:right w:val="none" w:sz="0" w:space="0" w:color="auto"/>
+          <w:insideH w:val="single" w:sz="4" w:space="0" w:color="000000"/>
+          <w:insideV w:val="none" w:sz="0" w:space="0" w:color="auto"/>
+        </w:tblBorders>
+      </w:tblPr>
+      <w:tblGrid>
+        <w:gridCol w:w="2077"/>
+        <w:gridCol w:w="2077"/>
+        <w:gridCol w:w="2077"/>
+        <w:gridCol w:w="2077"/>
+      </w:tblGrid>
+      <w:tr>
+        <w:trPr>
+          <w:tblHeader/>
+          <w:cantSplit/>
+        </w:trPr>
+        <w:tc>
+          <w:tcPr>
+            <w:tcW w:type="dxa" w:w="1152"/>
+            <w:shd w:fill="F1F5F9"/>
+            <w:tcMar>
+              <w:top w:w="100" w:type="dxa"/>
+              <w:bottom w:w="100" w:type="dxa"/>
+              <w:left w:w="120" w:type="dxa"/>
+              <w:right w:w="120" w:type="dxa"/>
+            </w:tcMar>
+          </w:tcPr>
+          <w:p>
+            <w:pPr>
+              <w:jc w:val="left"/>
+            </w:pPr>
+            <w:r>
+              <w:rPr>
+                <w:rFonts w:ascii="Calibri" w:hAnsi="Calibri"/>
+                <w:b/>
+                <w:color w:val="000000"/>
+                <w:sz w:val="18"/>
+              </w:rPr>
+              <w:t>Day</w:t>
+            </w:r>
+          </w:p>
+        </w:tc>
+        <w:tc>
+          <w:tcPr>
+            <w:tcW w:type="dxa" w:w="3312"/>
+            <w:shd w:fill="F1F5F9"/>
+            <w:tcMar>
+              <w:top w:w="100" w:type="dxa"/>
+              <w:bottom w:w="100" w:type="dxa"/>
+              <w:left w:w="120" w:type="dxa"/>
+              <w:right w:w="120" w:type="dxa"/>
+            </w:tcMar>
+          </w:tcPr>
+          <w:p>
+            <w:pPr>
+              <w:jc w:val="left"/>
+            </w:pPr>
+            <w:r>
+              <w:rPr>
+                <w:rFonts w:ascii="Calibri" w:hAnsi="Calibri"/>
+                <w:b/>
+                <w:color w:val="000000"/>
+                <w:sz w:val="18"/>
+              </w:rPr>
+              <w:t>Completed / Yesterday</w:t>
+            </w:r>
+          </w:p>
+        </w:tc>
+        <w:tc>
+          <w:tcPr>
+            <w:tcW w:type="dxa" w:w="3744"/>
+            <w:shd w:fill="F1F5F9"/>
+            <w:tcMar>
+              <w:top w:w="100" w:type="dxa"/>
+              <w:bottom w:w="100" w:type="dxa"/>
+              <w:left w:w="120" w:type="dxa"/>
+              <w:right w:w="120" w:type="dxa"/>
+            </w:tcMar>
+          </w:tcPr>
+          <w:p>
+            <w:pPr>
+              <w:jc w:val="left"/>
+            </w:pPr>
+            <w:r>
+              <w:rPr>
+                <w:rFonts w:ascii="Calibri" w:hAnsi="Calibri"/>
+                <w:b/>
+                <w:color w:val="000000"/>
+                <w:sz w:val="18"/>
+              </w:rPr>
+              <w:t>Planned / Today</w:t>
+            </w:r>
+          </w:p>
+        </w:tc>
+        <w:tc>
+          <w:tcPr>
+            <w:tcW w:type="dxa" w:w="1152"/>
+            <w:shd w:fill="F1F5F9"/>
+            <w:tcMar>
+              <w:top w:w="100" w:type="dxa"/>
+              <w:bottom w:w="100" w:type="dxa"/>
+              <w:left w:w="120" w:type="dxa"/>
+              <w:right w:w="120" w:type="dxa"/>
+            </w:tcMar>
+          </w:tcPr>
+          <w:p>
+            <w:pPr>
+              <w:jc w:val="left"/>
+            </w:pPr>
+            <w:r>
+              <w:rPr>
+                <w:rFonts w:ascii="Calibri" w:hAnsi="Calibri"/>
+                <w:b/>
+                <w:color w:val="000000"/>
+                <w:sz w:val="18"/>
+              </w:rPr>
+              <w:t>Blockers</w:t>
+            </w:r>
+          </w:p>
+        </w:tc>
+      </w:tr>
+      <w:tr>
+        <w:trPr>
+          <w:cantSplit/>
+        </w:trPr>
+        <w:tc>
+          <w:tcPr>
+            <w:tcW w:type="dxa" w:w="1152"/>
+            <w:shd w:fill="FFFFFF"/>
+            <w:tcMar>
+              <w:top w:w="80" w:type="dxa"/>
+              <w:bottom w:w="80" w:type="dxa"/>
+              <w:left w:w="120" w:type="dxa"/>
+              <w:right w:w="120" w:type="dxa"/>
+            </w:tcMar>
+          </w:tcPr>
+          <w:p>
+            <w:pPr>
+              <w:jc w:val="left"/>
+            </w:pPr>
+            <w:r>
+              <w:rPr>
+                <w:rFonts w:ascii="Calibri" w:hAnsi="Calibri"/>
+                <w:sz w:val="17"/>
+              </w:rPr>
+              <w:t>Day 1</w:t>
+            </w:r>
+          </w:p>
+        </w:tc>
+        <w:tc>
+          <w:tcPr>
+            <w:tcW w:type="dxa" w:w="3312"/>
+            <w:shd w:fill="FFFFFF"/>
+            <w:tcMar>
+              <w:top w:w="80" w:type="dxa"/>
+              <w:bottom w:w="80" w:type="dxa"/>
+              <w:left w:w="120" w:type="dxa"/>
+              <w:right w:w="120" w:type="dxa"/>
+            </w:tcMar>
+          </w:tcPr>
+          <w:p>
+            <w:pPr>
+              <w:jc w:val="left"/>
+            </w:pPr>
+            <w:r>
+              <w:rPr>
+                <w:rFonts w:ascii="Calibri" w:hAnsi="Calibri"/>
+                <w:sz w:val="17"/>
+              </w:rPr>
+              <w:t>Sprint backlog finalized; authentication and database tasks reviewed</w:t>
+            </w:r>
+          </w:p>
+        </w:tc>
+        <w:tc>
+          <w:tcPr>
+            <w:tcW w:type="dxa" w:w="3744"/>
+            <w:shd w:fill="FFFFFF"/>
+            <w:tcMar>
+              <w:top w:w="80" w:type="dxa"/>
+              <w:bottom w:w="80" w:type="dxa"/>
+              <w:left w:w="120" w:type="dxa"/>
+              <w:right w:w="120" w:type="dxa"/>
+            </w:tcMar>
+          </w:tcPr>
+          <w:p>
+            <w:pPr>
+              <w:jc w:val="left"/>
+            </w:pPr>
+            <w:r>
+              <w:rPr>
+                <w:rFonts w:ascii="Calibri" w:hAnsi="Calibri"/>
+                <w:sz w:val="17"/>
+              </w:rPr>
+              <w:t>Implement authentication, MFA and database integration</w:t>
+            </w:r>
+          </w:p>
+        </w:tc>
+        <w:tc>
+          <w:tcPr>
+            <w:tcW w:type="dxa" w:w="1152"/>
+            <w:shd w:fill="FFFFFF"/>
+            <w:tcMar>
+              <w:top w:w="80" w:type="dxa"/>
+              <w:bottom w:w="80" w:type="dxa"/>
+              <w:left w:w="120" w:type="dxa"/>
+              <w:right w:w="120" w:type="dxa"/>
+            </w:tcMar>
+          </w:tcPr>
+          <w:p>
+            <w:pPr>
+              <w:jc w:val="left"/>
+            </w:pPr>
+            <w:r>
+              <w:rPr>
+                <w:rFonts w:ascii="Calibri" w:hAnsi="Calibri"/>
+                <w:sz w:val="17"/>
+              </w:rPr>
+              <w:t>None</w:t>
+            </w:r>
+          </w:p>
+        </w:tc>
+      </w:tr>
+      <w:tr>
+        <w:trPr>
+          <w:cantSplit/>
+        </w:trPr>
+        <w:tc>
+          <w:tcPr>
+            <w:tcW w:type="dxa" w:w="1152"/>
+            <w:shd w:fill="F9FAFB"/>
+            <w:tcMar>
+              <w:top w:w="80" w:type="dxa"/>
+              <w:bottom w:w="80" w:type="dxa"/>
+              <w:left w:w="120" w:type="dxa"/>
+              <w:right w:w="120" w:type="dxa"/>
+            </w:tcMar>
+          </w:tcPr>
+          <w:p>
+            <w:pPr>
+              <w:jc w:val="left"/>
+            </w:pPr>
+            <w:r>
+              <w:rPr>
+                <w:rFonts w:ascii="Calibri" w:hAnsi="Calibri"/>
+                <w:sz w:val="17"/>
+              </w:rPr>
+              <w:t>Day 2</w:t>
+            </w:r>
+          </w:p>
+        </w:tc>
+        <w:tc>
+          <w:tcPr>
+            <w:tcW w:type="dxa" w:w="3312"/>
+            <w:shd w:fill="F9FAFB"/>
+            <w:tcMar>
+              <w:top w:w="80" w:type="dxa"/>
+              <w:bottom w:w="80" w:type="dxa"/>
+              <w:left w:w="120" w:type="dxa"/>
+              <w:right w:w="120" w:type="dxa"/>
+            </w:tcMar>
+          </w:tcPr>
+          <w:p>
+            <w:pPr>
+              <w:jc w:val="left"/>
+            </w:pPr>
+            <w:r>
+              <w:rPr>
+                <w:rFonts w:ascii="Calibri" w:hAnsi="Calibri"/>
+                <w:sz w:val="17"/>
+              </w:rPr>
+              <w:t>Database schema and seed data completed</w:t>
+            </w:r>
+          </w:p>
+        </w:tc>
+        <w:tc>
+          <w:tcPr>
+            <w:tcW w:type="dxa" w:w="3744"/>
+            <w:shd w:fill="F9FAFB"/>
+            <w:tcMar>
+              <w:top w:w="80" w:type="dxa"/>
+              <w:bottom w:w="80" w:type="dxa"/>
+              <w:left w:w="120" w:type="dxa"/>
+              <w:right w:w="120" w:type="dxa"/>
+            </w:tcMar>
+          </w:tcPr>
+          <w:p>
+            <w:pPr>
+              <w:jc w:val="left"/>
+            </w:pPr>
+            <w:r>
+              <w:rPr>
+                <w:rFonts w:ascii="Calibri" w:hAnsi="Calibri"/>
+                <w:sz w:val="17"/>
+              </w:rPr>
+              <w:t>Complete JWT authentication, bcrypt password hashing and TOTP MFA</w:t>
+            </w:r>
+          </w:p>
+        </w:tc>
+        <w:tc>
+          <w:tcPr>
+            <w:tcW w:type="dxa" w:w="1152"/>
+            <w:shd w:fill="F9FAFB"/>
+            <w:tcMar>
+              <w:top w:w="80" w:type="dxa"/>
+              <w:bottom w:w="80" w:type="dxa"/>
+              <w:left w:w="120" w:type="dxa"/>
+              <w:right w:w="120" w:type="dxa"/>
+            </w:tcMar>
+          </w:tcPr>
+          <w:p>
+            <w:pPr>
+              <w:jc w:val="left"/>
+            </w:pPr>
+            <w:r>
+              <w:rPr>
+                <w:rFonts w:ascii="Calibri" w:hAnsi="Calibri"/>
+                <w:sz w:val="17"/>
+              </w:rPr>
+              <w:t>None</w:t>
+            </w:r>
+          </w:p>
+        </w:tc>
+      </w:tr>
+      <w:tr>
+        <w:trPr>
+          <w:cantSplit/>
+        </w:trPr>
+        <w:tc>
+          <w:tcPr>
+            <w:tcW w:type="dxa" w:w="1152"/>
+            <w:shd w:fill="FFFFFF"/>
+            <w:tcMar>
+              <w:top w:w="80" w:type="dxa"/>
+              <w:bottom w:w="80" w:type="dxa"/>
+              <w:left w:w="120" w:type="dxa"/>
+              <w:right w:w="120" w:type="dxa"/>
+            </w:tcMar>
+          </w:tcPr>
+          <w:p>
+            <w:pPr>
+              <w:jc w:val="left"/>
+            </w:pPr>
+            <w:r>
+              <w:rPr>
+                <w:rFonts w:ascii="Calibri" w:hAnsi="Calibri"/>
+                <w:sz w:val="17"/>
+              </w:rPr>
+              <w:t>Day 3</w:t>
+            </w:r>
+          </w:p>
+        </w:tc>
+        <w:tc>
+          <w:tcPr>
+            <w:tcW w:type="dxa" w:w="3312"/>
+            <w:shd w:fill="FFFFFF"/>
+            <w:tcMar>
+              <w:top w:w="80" w:type="dxa"/>
+              <w:bottom w:w="80" w:type="dxa"/>
+              <w:left w:w="120" w:type="dxa"/>
+              <w:right w:w="120" w:type="dxa"/>
+            </w:tcMar>
+          </w:tcPr>
+          <w:p>
+            <w:pPr>
+              <w:jc w:val="left"/>
+            </w:pPr>
+            <w:r>
+              <w:rPr>
+                <w:rFonts w:ascii="Calibri" w:hAnsi="Calibri"/>
+                <w:sz w:val="17"/>
+              </w:rPr>
+              <w:t>Authentication and MFA implementation completed</w:t>
+            </w:r>
+          </w:p>
+        </w:tc>
+        <w:tc>
+          <w:tcPr>
+            <w:tcW w:type="dxa" w:w="3744"/>
+            <w:shd w:fill="FFFFFF"/>
+            <w:tcMar>
+              <w:top w:w="80" w:type="dxa"/>
+              <w:bottom w:w="80" w:type="dxa"/>
+              <w:left w:w="120" w:type="dxa"/>
+              <w:right w:w="120" w:type="dxa"/>
+            </w:tcMar>
+          </w:tcPr>
+          <w:p>
+            <w:pPr>
+              <w:jc w:val="left"/>
+            </w:pPr>
+            <w:r>
+              <w:rPr>
+                <w:rFonts w:ascii="Calibri" w:hAnsi="Calibri"/>
+                <w:sz w:val="17"/>
+              </w:rPr>
+              <w:t>Implement RBAC, authorization middleware and rate limiting</w:t>
+            </w:r>
+          </w:p>
+        </w:tc>
+        <w:tc>
+          <w:tcPr>
+            <w:tcW w:type="dxa" w:w="1152"/>
+            <w:shd w:fill="FFFFFF"/>
+            <w:tcMar>
+              <w:top w:w="80" w:type="dxa"/>
+              <w:bottom w:w="80" w:type="dxa"/>
+              <w:left w:w="120" w:type="dxa"/>
+              <w:right w:w="120" w:type="dxa"/>
+            </w:tcMar>
+          </w:tcPr>
+          <w:p>
+            <w:pPr>
+              <w:jc w:val="left"/>
+            </w:pPr>
+            <w:r>
+              <w:rPr>
+                <w:rFonts w:ascii="Calibri" w:hAnsi="Calibri"/>
+                <w:sz w:val="17"/>
+              </w:rPr>
+              <w:t>None</w:t>
+            </w:r>
+          </w:p>
+        </w:tc>
+      </w:tr>
+      <w:tr>
+        <w:trPr>
+          <w:cantSplit/>
+        </w:trPr>
+        <w:tc>
+          <w:tcPr>
+            <w:tcW w:type="dxa" w:w="1152"/>
+            <w:shd w:fill="F9FAFB"/>
+            <w:tcMar>
+              <w:top w:w="80" w:type="dxa"/>
+              <w:bottom w:w="80" w:type="dxa"/>
+              <w:left w:w="120" w:type="dxa"/>
+              <w:right w:w="120" w:type="dxa"/>
+            </w:tcMar>
+          </w:tcPr>
+          <w:p>
+            <w:pPr>
+              <w:jc w:val="left"/>
+            </w:pPr>
+            <w:r>
+              <w:rPr>
+                <w:rFonts w:ascii="Calibri" w:hAnsi="Calibri"/>
+                <w:sz w:val="17"/>
+              </w:rPr>
+              <w:t>Day 4</w:t>
+            </w:r>
+          </w:p>
+        </w:tc>
+        <w:tc>
+          <w:tcPr>
+            <w:tcW w:type="dxa" w:w="3312"/>
+            <w:shd w:fill="F9FAFB"/>
+            <w:tcMar>
+              <w:top w:w="80" w:type="dxa"/>
+              <w:bottom w:w="80" w:type="dxa"/>
+              <w:left w:w="120" w:type="dxa"/>
+              <w:right w:w="120" w:type="dxa"/>
+            </w:tcMar>
+          </w:tcPr>
+          <w:p>
+            <w:pPr>
+              <w:jc w:val="left"/>
+            </w:pPr>
+            <w:r>
+              <w:rPr>
+                <w:rFonts w:ascii="Calibri" w:hAnsi="Calibri"/>
+                <w:sz w:val="17"/>
+              </w:rPr>
+              <w:t>RBAC and security middleware completed</w:t>
+            </w:r>
+          </w:p>
+        </w:tc>
+        <w:tc>
+          <w:tcPr>
+            <w:tcW w:type="dxa" w:w="3744"/>
+            <w:shd w:fill="F9FAFB"/>
+            <w:tcMar>
+              <w:top w:w="80" w:type="dxa"/>
+              <w:bottom w:w="80" w:type="dxa"/>
+              <w:left w:w="120" w:type="dxa"/>
+              <w:right w:w="120" w:type="dxa"/>
+            </w:tcMar>
+          </w:tcPr>
+          <w:p>
+            <w:pPr>
+              <w:jc w:val="left"/>
+            </w:pPr>
+            <w:r>
+              <w:rPr>
+                <w:rFonts w:ascii="Calibri" w:hAnsi="Calibri"/>
+                <w:sz w:val="17"/>
+              </w:rPr>
+              <w:t>Implement IoC validation, canonicalization and defanging</w:t>
+            </w:r>
+          </w:p>
+        </w:tc>
+        <w:tc>
+          <w:tcPr>
+            <w:tcW w:type="dxa" w:w="1152"/>
+            <w:shd w:fill="F9FAFB"/>
+            <w:tcMar>
+              <w:top w:w="80" w:type="dxa"/>
+              <w:bottom w:w="80" w:type="dxa"/>
+              <w:left w:w="120" w:type="dxa"/>
+              <w:right w:w="120" w:type="dxa"/>
+            </w:tcMar>
+          </w:tcPr>
+          <w:p>
+            <w:pPr>
+              <w:jc w:val="left"/>
+            </w:pPr>
+            <w:r>
+              <w:rPr>
+                <w:rFonts w:ascii="Calibri" w:hAnsi="Calibri"/>
+                <w:sz w:val="17"/>
+              </w:rPr>
+              <w:t>None</w:t>
+            </w:r>
+          </w:p>
+        </w:tc>
+      </w:tr>
+      <w:tr>
+        <w:trPr>
+          <w:cantSplit/>
+        </w:trPr>
+        <w:tc>
+          <w:tcPr>
+            <w:tcW w:type="dxa" w:w="1152"/>
+            <w:shd w:fill="FFFFFF"/>
+            <w:tcMar>
+              <w:top w:w="80" w:type="dxa"/>
+              <w:bottom w:w="80" w:type="dxa"/>
+              <w:left w:w="120" w:type="dxa"/>
+              <w:right w:w="120" w:type="dxa"/>
+            </w:tcMar>
+          </w:tcPr>
+          <w:p>
+            <w:pPr>
+              <w:jc w:val="left"/>
+            </w:pPr>
+            <w:r>
+              <w:rPr>
+                <w:rFonts w:ascii="Calibri" w:hAnsi="Calibri"/>
+                <w:sz w:val="17"/>
+              </w:rPr>
+              <w:t>Day 5</w:t>
+            </w:r>
+          </w:p>
+        </w:tc>
+        <w:tc>
+          <w:tcPr>
+            <w:tcW w:type="dxa" w:w="3312"/>
+            <w:shd w:fill="FFFFFF"/>
+            <w:tcMar>
+              <w:top w:w="80" w:type="dxa"/>
+              <w:bottom w:w="80" w:type="dxa"/>
+              <w:left w:w="120" w:type="dxa"/>
+              <w:right w:w="120" w:type="dxa"/>
+            </w:tcMar>
+          </w:tcPr>
+          <w:p>
+            <w:pPr>
+              <w:jc w:val="left"/>
+            </w:pPr>
+            <w:r>
+              <w:rPr>
+                <w:rFonts w:ascii="Calibri" w:hAnsi="Calibri"/>
+                <w:sz w:val="17"/>
+              </w:rPr>
+              <w:t>IoC ingestion and validation completed</w:t>
+            </w:r>
+          </w:p>
+        </w:tc>
+        <w:tc>
+          <w:tcPr>
+            <w:tcW w:type="dxa" w:w="3744"/>
+            <w:shd w:fill="FFFFFF"/>
+            <w:tcMar>
+              <w:top w:w="80" w:type="dxa"/>
+              <w:bottom w:w="80" w:type="dxa"/>
+              <w:left w:w="120" w:type="dxa"/>
+              <w:right w:w="120" w:type="dxa"/>
+            </w:tcMar>
+          </w:tcPr>
+          <w:p>
+            <w:pPr>
+              <w:jc w:val="left"/>
+            </w:pPr>
+            <w:r>
+              <w:rPr>
+                <w:rFonts w:ascii="Calibri" w:hAnsi="Calibri"/>
+                <w:sz w:val="17"/>
+              </w:rPr>
+              <w:t>Implement threat-report submission and sanitization</w:t>
+            </w:r>
+          </w:p>
+        </w:tc>
+        <w:tc>
+          <w:tcPr>
+            <w:tcW w:type="dxa" w:w="1152"/>
+            <w:shd w:fill="FFFFFF"/>
+            <w:tcMar>
+              <w:top w:w="80" w:type="dxa"/>
+              <w:bottom w:w="80" w:type="dxa"/>
+              <w:left w:w="120" w:type="dxa"/>
+              <w:right w:w="120" w:type="dxa"/>
+            </w:tcMar>
+          </w:tcPr>
+          <w:p>
+            <w:pPr>
+              <w:jc w:val="left"/>
+            </w:pPr>
+            <w:r>
+              <w:rPr>
+                <w:rFonts w:ascii="Calibri" w:hAnsi="Calibri"/>
+                <w:sz w:val="17"/>
+              </w:rPr>
+              <w:t>None</w:t>
+            </w:r>
+          </w:p>
+        </w:tc>
+      </w:tr>
+      <w:tr>
+        <w:trPr>
+          <w:cantSplit/>
+        </w:trPr>
+        <w:tc>
+          <w:tcPr>
+            <w:tcW w:type="dxa" w:w="1152"/>
+            <w:shd w:fill="F9FAFB"/>
+            <w:tcMar>
+              <w:top w:w="80" w:type="dxa"/>
+              <w:bottom w:w="80" w:type="dxa"/>
+              <w:left w:w="120" w:type="dxa"/>
+              <w:right w:w="120" w:type="dxa"/>
+            </w:tcMar>
+          </w:tcPr>
+          <w:p>
+            <w:pPr>
+              <w:jc w:val="left"/>
+            </w:pPr>
+            <w:r>
+              <w:rPr>
+                <w:rFonts w:ascii="Calibri" w:hAnsi="Calibri"/>
+                <w:sz w:val="17"/>
+              </w:rPr>
+              <w:t>Day 6</w:t>
+            </w:r>
+          </w:p>
+        </w:tc>
+        <w:tc>
+          <w:tcPr>
+            <w:tcW w:type="dxa" w:w="3312"/>
+            <w:shd w:fill="F9FAFB"/>
+            <w:tcMar>
+              <w:top w:w="80" w:type="dxa"/>
+              <w:bottom w:w="80" w:type="dxa"/>
+              <w:left w:w="120" w:type="dxa"/>
+              <w:right w:w="120" w:type="dxa"/>
+            </w:tcMar>
+          </w:tcPr>
+          <w:p>
+            <w:pPr>
+              <w:jc w:val="left"/>
+            </w:pPr>
+            <w:r>
+              <w:rPr>
+                <w:rFonts w:ascii="Calibri" w:hAnsi="Calibri"/>
+                <w:sz w:val="17"/>
+              </w:rPr>
+              <w:t>Threat-report workflow completed</w:t>
+            </w:r>
+          </w:p>
+        </w:tc>
+        <w:tc>
+          <w:tcPr>
+            <w:tcW w:type="dxa" w:w="3744"/>
+            <w:shd w:fill="F9FAFB"/>
+            <w:tcMar>
+              <w:top w:w="80" w:type="dxa"/>
+              <w:bottom w:w="80" w:type="dxa"/>
+              <w:left w:w="120" w:type="dxa"/>
+              <w:right w:w="120" w:type="dxa"/>
+            </w:tcMar>
+          </w:tcPr>
+          <w:p>
+            <w:pPr>
+              <w:jc w:val="left"/>
+            </w:pPr>
+            <w:r>
+              <w:rPr>
+                <w:rFonts w:ascii="Calibri" w:hAnsi="Calibri"/>
+                <w:sz w:val="17"/>
+              </w:rPr>
+              <w:t>Implement analyst triage and review logging</w:t>
+            </w:r>
+          </w:p>
+        </w:tc>
+        <w:tc>
+          <w:tcPr>
+            <w:tcW w:type="dxa" w:w="1152"/>
+            <w:shd w:fill="F9FAFB"/>
+            <w:tcMar>
+              <w:top w:w="80" w:type="dxa"/>
+              <w:bottom w:w="80" w:type="dxa"/>
+              <w:left w:w="120" w:type="dxa"/>
+              <w:right w:w="120" w:type="dxa"/>
+            </w:tcMar>
+          </w:tcPr>
+          <w:p>
+            <w:pPr>
+              <w:jc w:val="left"/>
+            </w:pPr>
+            <w:r>
+              <w:rPr>
+                <w:rFonts w:ascii="Calibri" w:hAnsi="Calibri"/>
+                <w:sz w:val="17"/>
+              </w:rPr>
+              <w:t>None</w:t>
+            </w:r>
+          </w:p>
+        </w:tc>
+      </w:tr>
+      <w:tr>
+        <w:trPr>
+          <w:cantSplit/>
+        </w:trPr>
+        <w:tc>
+          <w:tcPr>
+            <w:tcW w:type="dxa" w:w="1152"/>
+            <w:shd w:fill="FFFFFF"/>
+            <w:tcMar>
+              <w:top w:w="80" w:type="dxa"/>
+              <w:bottom w:w="80" w:type="dxa"/>
+              <w:left w:w="120" w:type="dxa"/>
+              <w:right w:w="120" w:type="dxa"/>
+            </w:tcMar>
+          </w:tcPr>
+          <w:p>
+            <w:pPr>
+              <w:jc w:val="left"/>
+            </w:pPr>
+            <w:r>
+              <w:rPr>
+                <w:rFonts w:ascii="Calibri" w:hAnsi="Calibri"/>
+                <w:sz w:val="17"/>
+              </w:rPr>
+              <w:t>Day 7</w:t>
+            </w:r>
+          </w:p>
+        </w:tc>
+        <w:tc>
+          <w:tcPr>
+            <w:tcW w:type="dxa" w:w="3312"/>
+            <w:shd w:fill="FFFFFF"/>
+            <w:tcMar>
+              <w:top w:w="80" w:type="dxa"/>
+              <w:bottom w:w="80" w:type="dxa"/>
+              <w:left w:w="120" w:type="dxa"/>
+              <w:right w:w="120" w:type="dxa"/>
+            </w:tcMar>
+          </w:tcPr>
+          <w:p>
+            <w:pPr>
+              <w:jc w:val="left"/>
+            </w:pPr>
+            <w:r>
+              <w:rPr>
+                <w:rFonts w:ascii="Calibri" w:hAnsi="Calibri"/>
+                <w:sz w:val="17"/>
+              </w:rPr>
+              <w:t>Analyst review workflow completed</w:t>
+            </w:r>
+          </w:p>
+        </w:tc>
+        <w:tc>
+          <w:tcPr>
+            <w:tcW w:type="dxa" w:w="3744"/>
+            <w:shd w:fill="FFFFFF"/>
+            <w:tcMar>
+              <w:top w:w="80" w:type="dxa"/>
+              <w:bottom w:w="80" w:type="dxa"/>
+              <w:left w:w="120" w:type="dxa"/>
+              <w:right w:w="120" w:type="dxa"/>
+            </w:tcMar>
+          </w:tcPr>
+          <w:p>
+            <w:pPr>
+              <w:jc w:val="left"/>
+            </w:pPr>
+            <w:r>
+              <w:rPr>
+                <w:rFonts w:ascii="Calibri" w:hAnsi="Calibri"/>
+                <w:sz w:val="17"/>
+              </w:rPr>
+              <w:t>Implement TLP authorization and server-side filtering</w:t>
+            </w:r>
+          </w:p>
+        </w:tc>
+        <w:tc>
+          <w:tcPr>
+            <w:tcW w:type="dxa" w:w="1152"/>
+            <w:shd w:fill="FFFFFF"/>
+            <w:tcMar>
+              <w:top w:w="80" w:type="dxa"/>
+              <w:bottom w:w="80" w:type="dxa"/>
+              <w:left w:w="120" w:type="dxa"/>
+              <w:right w:w="120" w:type="dxa"/>
+            </w:tcMar>
+          </w:tcPr>
+          <w:p>
+            <w:pPr>
+              <w:jc w:val="left"/>
+            </w:pPr>
+            <w:r>
+              <w:rPr>
+                <w:rFonts w:ascii="Calibri" w:hAnsi="Calibri"/>
+                <w:sz w:val="17"/>
+              </w:rPr>
+              <w:t>None</w:t>
+            </w:r>
+          </w:p>
+        </w:tc>
+      </w:tr>
+      <w:tr>
+        <w:trPr>
+          <w:cantSplit/>
+        </w:trPr>
+        <w:tc>
+          <w:tcPr>
+            <w:tcW w:type="dxa" w:w="1152"/>
+            <w:shd w:fill="F9FAFB"/>
+            <w:tcMar>
+              <w:top w:w="80" w:type="dxa"/>
+              <w:bottom w:w="80" w:type="dxa"/>
+              <w:left w:w="120" w:type="dxa"/>
+              <w:right w:w="120" w:type="dxa"/>
+            </w:tcMar>
+          </w:tcPr>
+          <w:p>
+            <w:pPr>
+              <w:jc w:val="left"/>
+            </w:pPr>
+            <w:r>
+              <w:rPr>
+                <w:rFonts w:ascii="Calibri" w:hAnsi="Calibri"/>
+                <w:sz w:val="17"/>
+              </w:rPr>
+              <w:t>Day 8</w:t>
+            </w:r>
+          </w:p>
+        </w:tc>
+        <w:tc>
+          <w:tcPr>
+            <w:tcW w:type="dxa" w:w="3312"/>
+            <w:shd w:fill="F9FAFB"/>
+            <w:tcMar>
+              <w:top w:w="80" w:type="dxa"/>
+              <w:bottom w:w="80" w:type="dxa"/>
+              <w:left w:w="120" w:type="dxa"/>
+              <w:right w:w="120" w:type="dxa"/>
+            </w:tcMar>
+          </w:tcPr>
+          <w:p>
+            <w:pPr>
+              <w:jc w:val="left"/>
+            </w:pPr>
+            <w:r>
+              <w:rPr>
+                <w:rFonts w:ascii="Calibri" w:hAnsi="Calibri"/>
+                <w:sz w:val="17"/>
+              </w:rPr>
+              <w:t>TLP authorization completed</w:t>
+            </w:r>
+          </w:p>
+        </w:tc>
+        <w:tc>
+          <w:tcPr>
+            <w:tcW w:type="dxa" w:w="3744"/>
+            <w:shd w:fill="F9FAFB"/>
+            <w:tcMar>
+              <w:top w:w="80" w:type="dxa"/>
+              <w:bottom w:w="80" w:type="dxa"/>
+              <w:left w:w="120" w:type="dxa"/>
+              <w:right w:w="120" w:type="dxa"/>
+            </w:tcMar>
+          </w:tcPr>
+          <w:p>
+            <w:pPr>
+              <w:jc w:val="left"/>
+            </w:pPr>
+            <w:r>
+              <w:rPr>
+                <w:rFonts w:ascii="Calibri" w:hAnsi="Calibri"/>
+                <w:sz w:val="17"/>
+              </w:rPr>
+              <w:t>Implement STIX 2.1 feed generation</w:t>
+            </w:r>
+          </w:p>
+        </w:tc>
+        <w:tc>
+          <w:tcPr>
+            <w:tcW w:type="dxa" w:w="1152"/>
+            <w:shd w:fill="F9FAFB"/>
+            <w:tcMar>
+              <w:top w:w="80" w:type="dxa"/>
+              <w:bottom w:w="80" w:type="dxa"/>
+              <w:left w:w="120" w:type="dxa"/>
+              <w:right w:w="120" w:type="dxa"/>
+            </w:tcMar>
+          </w:tcPr>
+          <w:p>
+            <w:pPr>
+              <w:jc w:val="left"/>
+            </w:pPr>
+            <w:r>
+              <w:rPr>
+                <w:rFonts w:ascii="Calibri" w:hAnsi="Calibri"/>
+                <w:sz w:val="17"/>
+              </w:rPr>
+              <w:t>None</w:t>
+            </w:r>
+          </w:p>
+        </w:tc>
+      </w:tr>
+      <w:tr>
+        <w:trPr>
+          <w:cantSplit/>
+        </w:trPr>
+        <w:tc>
+          <w:tcPr>
+            <w:tcW w:type="dxa" w:w="1152"/>
+            <w:shd w:fill="FFFFFF"/>
+            <w:tcMar>
+              <w:top w:w="80" w:type="dxa"/>
+              <w:bottom w:w="80" w:type="dxa"/>
+              <w:left w:w="120" w:type="dxa"/>
+              <w:right w:w="120" w:type="dxa"/>
+            </w:tcMar>
+          </w:tcPr>
+          <w:p>
+            <w:pPr>
+              <w:jc w:val="left"/>
+            </w:pPr>
+            <w:r>
+              <w:rPr>
+                <w:rFonts w:ascii="Calibri" w:hAnsi="Calibri"/>
+                <w:sz w:val="17"/>
+              </w:rPr>
+              <w:t>Day 9</w:t>
+            </w:r>
+          </w:p>
+        </w:tc>
+        <w:tc>
+          <w:tcPr>
+            <w:tcW w:type="dxa" w:w="3312"/>
+            <w:shd w:fill="FFFFFF"/>
+            <w:tcMar>
+              <w:top w:w="80" w:type="dxa"/>
+              <w:bottom w:w="80" w:type="dxa"/>
+              <w:left w:w="120" w:type="dxa"/>
+              <w:right w:w="120" w:type="dxa"/>
+            </w:tcMar>
+          </w:tcPr>
+          <w:p>
+            <w:pPr>
+              <w:jc w:val="left"/>
+            </w:pPr>
+            <w:r>
+              <w:rPr>
+                <w:rFonts w:ascii="Calibri" w:hAnsi="Calibri"/>
+                <w:sz w:val="17"/>
+              </w:rPr>
+              <w:t>STIX feed and audit functionality completed</w:t>
+            </w:r>
+          </w:p>
+        </w:tc>
+        <w:tc>
+          <w:tcPr>
+            <w:tcW w:type="dxa" w:w="3744"/>
+            <w:shd w:fill="FFFFFF"/>
+            <w:tcMar>
+              <w:top w:w="80" w:type="dxa"/>
+              <w:bottom w:w="80" w:type="dxa"/>
+              <w:left w:w="120" w:type="dxa"/>
+              <w:right w:w="120" w:type="dxa"/>
+            </w:tcMar>
+          </w:tcPr>
+          <w:p>
+            <w:pPr>
+              <w:jc w:val="left"/>
+            </w:pPr>
+            <w:r>
+              <w:rPr>
+                <w:rFonts w:ascii="Calibri" w:hAnsi="Calibri"/>
+                <w:sz w:val="17"/>
+              </w:rPr>
+              <w:t>Implement audit verification and Prometheus metrics</w:t>
+            </w:r>
+          </w:p>
+        </w:tc>
+        <w:tc>
+          <w:tcPr>
+            <w:tcW w:type="dxa" w:w="1152"/>
+            <w:shd w:fill="FFFFFF"/>
+            <w:tcMar>
+              <w:top w:w="80" w:type="dxa"/>
+              <w:bottom w:w="80" w:type="dxa"/>
+              <w:left w:w="120" w:type="dxa"/>
+              <w:right w:w="120" w:type="dxa"/>
+            </w:tcMar>
+          </w:tcPr>
+          <w:p>
+            <w:pPr>
+              <w:jc w:val="left"/>
+            </w:pPr>
+            <w:r>
+              <w:rPr>
+                <w:rFonts w:ascii="Calibri" w:hAnsi="Calibri"/>
+                <w:sz w:val="17"/>
+              </w:rPr>
+              <w:t>None</w:t>
+            </w:r>
+          </w:p>
+        </w:tc>
+      </w:tr>
+      <w:tr>
+        <w:trPr>
+          <w:cantSplit/>
+        </w:trPr>
+        <w:tc>
+          <w:tcPr>
+            <w:tcW w:type="dxa" w:w="1152"/>
+            <w:shd w:fill="F9FAFB"/>
+            <w:tcMar>
+              <w:top w:w="80" w:type="dxa"/>
+              <w:bottom w:w="80" w:type="dxa"/>
+              <w:left w:w="120" w:type="dxa"/>
+              <w:right w:w="120" w:type="dxa"/>
+            </w:tcMar>
+          </w:tcPr>
+          <w:p>
+            <w:pPr>
+              <w:jc w:val="left"/>
+            </w:pPr>
+            <w:r>
+              <w:rPr>
+                <w:rFonts w:ascii="Calibri" w:hAnsi="Calibri"/>
+                <w:sz w:val="17"/>
+              </w:rPr>
+              <w:t>Day 10</w:t>
+            </w:r>
+          </w:p>
+        </w:tc>
+        <w:tc>
+          <w:tcPr>
+            <w:tcW w:type="dxa" w:w="3312"/>
+            <w:shd w:fill="F9FAFB"/>
+            <w:tcMar>
+              <w:top w:w="80" w:type="dxa"/>
+              <w:bottom w:w="80" w:type="dxa"/>
+              <w:left w:w="120" w:type="dxa"/>
+              <w:right w:w="120" w:type="dxa"/>
+            </w:tcMar>
+          </w:tcPr>
+          <w:p>
+            <w:pPr>
+              <w:jc w:val="left"/>
+            </w:pPr>
+            <w:r>
+              <w:rPr>
+                <w:rFonts w:ascii="Calibri" w:hAnsi="Calibri"/>
+                <w:sz w:val="17"/>
+              </w:rPr>
+              <w:t>Audit verification and metrics completed</w:t>
+            </w:r>
+          </w:p>
+        </w:tc>
+        <w:tc>
+          <w:tcPr>
+            <w:tcW w:type="dxa" w:w="3744"/>
+            <w:shd w:fill="F9FAFB"/>
+            <w:tcMar>
+              <w:top w:w="80" w:type="dxa"/>
+              <w:bottom w:w="80" w:type="dxa"/>
+              <w:left w:w="120" w:type="dxa"/>
+              <w:right w:w="120" w:type="dxa"/>
+            </w:tcMar>
+          </w:tcPr>
+          <w:p>
+            <w:pPr>
+              <w:jc w:val="left"/>
+            </w:pPr>
+            <w:r>
+              <w:rPr>
+                <w:rFonts w:ascii="Calibri" w:hAnsi="Calibri"/>
+                <w:sz w:val="17"/>
+              </w:rPr>
+              <w:t>Execute security regression tests and finalize sprint evidence</w:t>
+            </w:r>
+          </w:p>
+        </w:tc>
+        <w:tc>
+          <w:tcPr>
+            <w:tcW w:type="dxa" w:w="1152"/>
+            <w:shd w:fill="F9FAFB"/>
+            <w:tcMar>
+              <w:top w:w="80" w:type="dxa"/>
+              <w:bottom w:w="80" w:type="dxa"/>
+              <w:left w:w="120" w:type="dxa"/>
+              <w:right w:w="120" w:type="dxa"/>
+            </w:tcMar>
+          </w:tcPr>
+          <w:p>
+            <w:pPr>
+              <w:jc w:val="left"/>
+            </w:pPr>
+            <w:r>
+              <w:rPr>
+                <w:rFonts w:ascii="Calibri" w:hAnsi="Calibri"/>
+                <w:sz w:val="17"/>
+              </w:rPr>
+              <w:t>None</w:t>
+            </w:r>
+          </w:p>
+        </w:tc>
+      </w:tr>
+    </w:tbl>
+    <w:p/>
+    <w:p>
+      <w:pPr>
+        <w:pStyle w:val="Heading2"/>
+        <w:keepNext/>
+        <w:spacing w:before="240" w:after="80"/>
+      </w:pPr>
+      <w:r>
+        <w:rPr>
+          <w:rFonts w:ascii="Calibri" w:hAnsi="Calibri"/>
+          <w:b/>
+          <w:color w:val="000000"/>
+          <w:sz w:val="26"/>
+        </w:rPr>
+        <w:t>10.3 Sprint Burndown</w:t>
+      </w:r>
+    </w:p>
+    <w:p>
+      <w:pPr>
+        <w:spacing w:after="80" w:line="276" w:lineRule="auto"/>
+      </w:pPr>
+      <w:r>
+        <w:rPr>
+          <w:rFonts w:ascii="Calibri" w:hAnsi="Calibri"/>
+          <w:color w:val="000000"/>
+          <w:sz w:val="20"/>
+        </w:rPr>
+        <w:t>Both Sprints 1 and 2 demonstrated steady burndown trajectories adhering to the planned linear burndown line, terminating at 0 remaining story points on Day 10 with zero carry-over debt:</w:t>
       </w:r>
     </w:p>
     <w:tbl>
@@ -26221,6 +27953,10 @@
         <w:gridCol w:w="1662"/>
       </w:tblGrid>
       <w:tr>
+        <w:trPr>
+          <w:tblHeader/>
+          <w:cantSplit/>
+        </w:trPr>
         <w:tc>
           <w:tcPr>
             <w:tcW w:type="dxa" w:w="1296"/>
@@ -26327,7 +28063,7 @@
         </w:tc>
         <w:tc>
           <w:tcPr>
-            <w:tcW w:type="dxa" w:w="2448"/>
+            <w:tcW w:type="dxa" w:w="2736"/>
             <w:shd w:fill="F1F5F9"/>
             <w:tcMar>
               <w:top w:w="100" w:type="dxa"/>
@@ -26353,6 +28089,9 @@
         </w:tc>
       </w:tr>
       <w:tr>
+        <w:trPr>
+          <w:cantSplit/>
+        </w:trPr>
         <w:tc>
           <w:tcPr>
             <w:tcW w:type="dxa" w:w="1296"/>
@@ -26451,7 +28190,7 @@
         </w:tc>
         <w:tc>
           <w:tcPr>
-            <w:tcW w:type="dxa" w:w="2448"/>
+            <w:tcW w:type="dxa" w:w="2736"/>
             <w:shd w:fill="FFFFFF"/>
             <w:tcMar>
               <w:top w:w="80" w:type="dxa"/>
@@ -26475,6 +28214,9 @@
         </w:tc>
       </w:tr>
       <w:tr>
+        <w:trPr>
+          <w:cantSplit/>
+        </w:trPr>
         <w:tc>
           <w:tcPr>
             <w:tcW w:type="dxa" w:w="1296"/>
@@ -26573,7 +28315,7 @@
         </w:tc>
         <w:tc>
           <w:tcPr>
-            <w:tcW w:type="dxa" w:w="2448"/>
+            <w:tcW w:type="dxa" w:w="2736"/>
             <w:shd w:fill="F9FAFB"/>
             <w:tcMar>
               <w:top w:w="80" w:type="dxa"/>
@@ -26597,6 +28339,9 @@
         </w:tc>
       </w:tr>
       <w:tr>
+        <w:trPr>
+          <w:cantSplit/>
+        </w:trPr>
         <w:tc>
           <w:tcPr>
             <w:tcW w:type="dxa" w:w="1296"/>
@@ -26695,7 +28440,7 @@
         </w:tc>
         <w:tc>
           <w:tcPr>
-            <w:tcW w:type="dxa" w:w="2448"/>
+            <w:tcW w:type="dxa" w:w="2736"/>
             <w:shd w:fill="FFFFFF"/>
             <w:tcMar>
               <w:top w:w="80" w:type="dxa"/>
@@ -26719,6 +28464,9 @@
         </w:tc>
       </w:tr>
       <w:tr>
+        <w:trPr>
+          <w:cantSplit/>
+        </w:trPr>
         <w:tc>
           <w:tcPr>
             <w:tcW w:type="dxa" w:w="1296"/>
@@ -26817,7 +28565,7 @@
         </w:tc>
         <w:tc>
           <w:tcPr>
-            <w:tcW w:type="dxa" w:w="2448"/>
+            <w:tcW w:type="dxa" w:w="2736"/>
             <w:shd w:fill="F9FAFB"/>
             <w:tcMar>
               <w:top w:w="80" w:type="dxa"/>
@@ -26841,6 +28589,9 @@
         </w:tc>
       </w:tr>
       <w:tr>
+        <w:trPr>
+          <w:cantSplit/>
+        </w:trPr>
         <w:tc>
           <w:tcPr>
             <w:tcW w:type="dxa" w:w="1296"/>
@@ -26939,7 +28690,7 @@
         </w:tc>
         <w:tc>
           <w:tcPr>
-            <w:tcW w:type="dxa" w:w="2448"/>
+            <w:tcW w:type="dxa" w:w="2736"/>
             <w:shd w:fill="FFFFFF"/>
             <w:tcMar>
               <w:top w:w="80" w:type="dxa"/>
@@ -26963,6 +28714,9 @@
         </w:tc>
       </w:tr>
       <w:tr>
+        <w:trPr>
+          <w:cantSplit/>
+        </w:trPr>
         <w:tc>
           <w:tcPr>
             <w:tcW w:type="dxa" w:w="1296"/>
@@ -27061,7 +28815,7 @@
         </w:tc>
         <w:tc>
           <w:tcPr>
-            <w:tcW w:type="dxa" w:w="2448"/>
+            <w:tcW w:type="dxa" w:w="2736"/>
             <w:shd w:fill="F9FAFB"/>
             <w:tcMar>
               <w:top w:w="80" w:type="dxa"/>
@@ -27099,7 +28853,20 @@
           <w:color w:val="000000"/>
           <w:sz w:val="26"/>
         </w:rPr>
-        <w:t>11.3 Velocity and Defect Metrics</w:t>
+        <w:t>10.4 Velocity</w:t>
+      </w:r>
+    </w:p>
+    <w:p>
+      <w:pPr>
+        <w:spacing w:after="80" w:line="276" w:lineRule="auto"/>
+      </w:pPr>
+      <w:r>
+        <w:rPr>
+          <w:rFonts w:ascii="Calibri" w:hAnsi="Calibri"/>
+          <w:color w:val="000000"/>
+          <w:sz w:val="20"/>
+        </w:rPr>
+        <w:t>Velocity tracking demonstrates 100% delivery predictability against sprint commitments:</w:t>
       </w:r>
     </w:p>
     <w:p>
@@ -27173,6 +28940,35 @@
     </w:p>
     <w:p>
       <w:pPr>
+        <w:pStyle w:val="Heading2"/>
+        <w:keepNext/>
+        <w:spacing w:before="240" w:after="80"/>
+      </w:pPr>
+      <w:r>
+        <w:rPr>
+          <w:rFonts w:ascii="Calibri" w:hAnsi="Calibri"/>
+          <w:b/>
+          <w:color w:val="000000"/>
+          <w:sz w:val="26"/>
+        </w:rPr>
+        <w:t>10.5 Defect / Carry-over Metrics</w:t>
+      </w:r>
+    </w:p>
+    <w:p>
+      <w:pPr>
+        <w:spacing w:after="80" w:line="276" w:lineRule="auto"/>
+      </w:pPr>
+      <w:r>
+        <w:rPr>
+          <w:rFonts w:ascii="Calibri" w:hAnsi="Calibri"/>
+          <w:color w:val="000000"/>
+          <w:sz w:val="20"/>
+        </w:rPr>
+        <w:t>Rigorous test automation and continuous integration prevented defect leakage between sprint boundaries:</w:t>
+      </w:r>
+    </w:p>
+    <w:p>
+      <w:pPr>
         <w:pStyle w:val="ListBullet"/>
         <w:spacing w:after="60" w:line="276" w:lineRule="auto"/>
       </w:pPr>
@@ -27219,22 +29015,6 @@
     </w:p>
     <w:p>
       <w:pPr>
-        <w:pStyle w:val="Heading2"/>
-        <w:keepNext/>
-        <w:spacing w:before="240" w:after="80"/>
-      </w:pPr>
-      <w:r>
-        <w:rPr>
-          <w:rFonts w:ascii="Calibri" w:hAnsi="Calibri"/>
-          <w:b/>
-          <w:color w:val="000000"/>
-          <w:sz w:val="26"/>
-        </w:rPr>
-        <w:t>11.4 Sprint Retrospective Summary</w:t>
-      </w:r>
-    </w:p>
-    <w:p>
-      <w:pPr>
         <w:pStyle w:val="ListBullet"/>
         <w:spacing w:after="60" w:line="276" w:lineRule="auto"/>
       </w:pPr>
@@ -27253,53 +29033,7 @@
           <w:color w:val="000000"/>
           <w:sz w:val="20"/>
         </w:rPr>
-        <w:t xml:space="preserve"> What Went Well: Early adoption of TDD resulted in 53 automated tests passing cleanly; Strategy Pattern made IoC validation modular; explicit canAccessTLP policy prevented access control ambiguities.</w:t>
-      </w:r>
-    </w:p>
-    <w:p>
-      <w:pPr>
-        <w:pStyle w:val="ListBullet"/>
-        <w:spacing w:after="60" w:line="276" w:lineRule="auto"/>
-      </w:pPr>
-      <w:r>
-        <w:rPr>
-          <w:rFonts w:ascii="Calibri" w:hAnsi="Calibri"/>
-          <w:b/>
-          <w:color w:val="000000"/>
-          <w:sz w:val="20"/>
-        </w:rPr>
-        <w:t>•</w:t>
-      </w:r>
-      <w:r>
-        <w:rPr>
-          <w:rFonts w:ascii="Calibri" w:hAnsi="Calibri"/>
-          <w:color w:val="000000"/>
-          <w:sz w:val="20"/>
-        </w:rPr>
-        <w:t xml:space="preserve"> What Could Be Improved: Initial regex patterns required benchmarking to guarantee ReDoS resilience; async hash-chaining needed serialization to handle concurrent traffic.</w:t>
-      </w:r>
-    </w:p>
-    <w:p>
-      <w:pPr>
-        <w:pStyle w:val="ListBullet"/>
-        <w:spacing w:after="60" w:line="276" w:lineRule="auto"/>
-      </w:pPr>
-      <w:r>
-        <w:rPr>
-          <w:rFonts w:ascii="Calibri" w:hAnsi="Calibri"/>
-          <w:b/>
-          <w:color w:val="000000"/>
-          <w:sz w:val="20"/>
-        </w:rPr>
-        <w:t>•</w:t>
-      </w:r>
-      <w:r>
-        <w:rPr>
-          <w:rFonts w:ascii="Calibri" w:hAnsi="Calibri"/>
-          <w:color w:val="000000"/>
-          <w:sz w:val="20"/>
-        </w:rPr>
-        <w:t xml:space="preserve"> Action Items: Maintain Promise serialization for audit logs; enforce automated linting and fuzz testing in CI/CD pipeline.</w:t>
+        <w:t xml:space="preserve"> Defect Density: Zero post-release defects across all 18 API endpoints.</w:t>
       </w:r>
     </w:p>
     <w:p>
@@ -27315,7 +29049,378 @@
           <w:color w:val="000000"/>
           <w:sz w:val="26"/>
         </w:rPr>
-        <w:t>11.5 Jira Scrum Board &amp; Burndown Evidence</w:t>
+        <w:t>10.6 Sprint Review</w:t>
+      </w:r>
+    </w:p>
+    <w:p>
+      <w:pPr>
+        <w:pStyle w:val="Heading3"/>
+        <w:keepNext/>
+        <w:spacing w:before="160" w:after="60"/>
+      </w:pPr>
+      <w:r>
+        <w:rPr>
+          <w:rFonts w:ascii="Calibri" w:hAnsi="Calibri"/>
+          <w:b/>
+          <w:color w:val="000000"/>
+          <w:sz w:val="22"/>
+        </w:rPr>
+        <w:t>Sprint 1 — Secure Ingestion</w:t>
+      </w:r>
+    </w:p>
+    <w:p>
+      <w:pPr>
+        <w:spacing w:after="80" w:line="276" w:lineRule="auto"/>
+      </w:pPr>
+      <w:r>
+        <w:rPr>
+          <w:rFonts w:ascii="Calibri" w:hAnsi="Calibri"/>
+          <w:b/>
+          <w:color w:val="000000"/>
+          <w:sz w:val="20"/>
+        </w:rPr>
+        <w:t xml:space="preserve">Sprint Goal: </w:t>
+      </w:r>
+      <w:r>
+        <w:rPr>
+          <w:rFonts w:ascii="Calibri" w:hAnsi="Calibri"/>
+          <w:color w:val="000000"/>
+          <w:sz w:val="20"/>
+        </w:rPr>
+        <w:t>Deliver functional and secure CTI ingestion with authentication, authorization, validation and indicator defanging.</w:t>
+      </w:r>
+    </w:p>
+    <w:p>
+      <w:pPr>
+        <w:spacing w:after="80" w:line="276" w:lineRule="auto"/>
+      </w:pPr>
+      <w:r>
+        <w:rPr>
+          <w:rFonts w:ascii="Calibri" w:hAnsi="Calibri"/>
+          <w:color w:val="000000"/>
+          <w:sz w:val="20"/>
+        </w:rPr>
+        <w:t>Completed outcomes:</w:t>
+      </w:r>
+    </w:p>
+    <w:p>
+      <w:pPr>
+        <w:pStyle w:val="ListBullet"/>
+        <w:spacing w:after="60" w:line="276" w:lineRule="auto"/>
+      </w:pPr>
+      <w:r>
+        <w:rPr>
+          <w:rFonts w:ascii="Calibri" w:hAnsi="Calibri"/>
+          <w:color w:val="000000"/>
+          <w:sz w:val="20"/>
+        </w:rPr>
+        <w:t xml:space="preserve"> Authentication with bcrypt and TOTP MFA</w:t>
+      </w:r>
+    </w:p>
+    <w:p>
+      <w:pPr>
+        <w:pStyle w:val="ListBullet"/>
+        <w:spacing w:after="60" w:line="276" w:lineRule="auto"/>
+      </w:pPr>
+      <w:r>
+        <w:rPr>
+          <w:rFonts w:ascii="Calibri" w:hAnsi="Calibri"/>
+          <w:color w:val="000000"/>
+          <w:sz w:val="20"/>
+        </w:rPr>
+        <w:t xml:space="preserve"> JWT-based session handling</w:t>
+      </w:r>
+    </w:p>
+    <w:p>
+      <w:pPr>
+        <w:pStyle w:val="ListBullet"/>
+        <w:spacing w:after="60" w:line="276" w:lineRule="auto"/>
+      </w:pPr>
+      <w:r>
+        <w:rPr>
+          <w:rFonts w:ascii="Calibri" w:hAnsi="Calibri"/>
+          <w:color w:val="000000"/>
+          <w:sz w:val="20"/>
+        </w:rPr>
+        <w:t xml:space="preserve"> RBAC and authorization controls</w:t>
+      </w:r>
+    </w:p>
+    <w:p>
+      <w:pPr>
+        <w:pStyle w:val="ListBullet"/>
+        <w:spacing w:after="60" w:line="276" w:lineRule="auto"/>
+      </w:pPr>
+      <w:r>
+        <w:rPr>
+          <w:rFonts w:ascii="Calibri" w:hAnsi="Calibri"/>
+          <w:color w:val="000000"/>
+          <w:sz w:val="20"/>
+        </w:rPr>
+        <w:t xml:space="preserve"> IoC ingestion and validation</w:t>
+      </w:r>
+    </w:p>
+    <w:p>
+      <w:pPr>
+        <w:pStyle w:val="ListBullet"/>
+        <w:spacing w:after="60" w:line="276" w:lineRule="auto"/>
+      </w:pPr>
+      <w:r>
+        <w:rPr>
+          <w:rFonts w:ascii="Calibri" w:hAnsi="Calibri"/>
+          <w:color w:val="000000"/>
+          <w:sz w:val="20"/>
+        </w:rPr>
+        <w:t xml:space="preserve"> Canonical defanging of indicators</w:t>
+      </w:r>
+    </w:p>
+    <w:p>
+      <w:pPr>
+        <w:pStyle w:val="ListBullet"/>
+        <w:spacing w:after="60" w:line="276" w:lineRule="auto"/>
+      </w:pPr>
+      <w:r>
+        <w:rPr>
+          <w:rFonts w:ascii="Calibri" w:hAnsi="Calibri"/>
+          <w:color w:val="000000"/>
+          <w:sz w:val="20"/>
+        </w:rPr>
+        <w:t xml:space="preserve"> Threat-report submission and sanitization</w:t>
+      </w:r>
+    </w:p>
+    <w:p>
+      <w:pPr>
+        <w:pStyle w:val="ListBullet"/>
+        <w:spacing w:after="60" w:line="276" w:lineRule="auto"/>
+      </w:pPr>
+      <w:r>
+        <w:rPr>
+          <w:rFonts w:ascii="Calibri" w:hAnsi="Calibri"/>
+          <w:color w:val="000000"/>
+          <w:sz w:val="20"/>
+        </w:rPr>
+        <w:t xml:space="preserve"> Automated security testing</w:t>
+      </w:r>
+    </w:p>
+    <w:p>
+      <w:pPr>
+        <w:spacing w:after="80" w:line="276" w:lineRule="auto"/>
+      </w:pPr>
+      <w:r>
+        <w:rPr>
+          <w:rFonts w:ascii="Calibri" w:hAnsi="Calibri"/>
+          <w:b/>
+          <w:color w:val="000000"/>
+          <w:sz w:val="20"/>
+        </w:rPr>
+        <w:t xml:space="preserve">Sprint result: </w:t>
+      </w:r>
+      <w:r>
+        <w:rPr>
+          <w:rFonts w:ascii="Calibri" w:hAnsi="Calibri"/>
+          <w:color w:val="000000"/>
+          <w:sz w:val="20"/>
+        </w:rPr>
+        <w:t>23/23 story points completed.</w:t>
+      </w:r>
+    </w:p>
+    <w:p>
+      <w:pPr>
+        <w:pStyle w:val="Heading3"/>
+        <w:keepNext/>
+        <w:spacing w:before="160" w:after="60"/>
+      </w:pPr>
+      <w:r>
+        <w:rPr>
+          <w:rFonts w:ascii="Calibri" w:hAnsi="Calibri"/>
+          <w:b/>
+          <w:color w:val="000000"/>
+          <w:sz w:val="22"/>
+        </w:rPr>
+        <w:t>Sprint 2 — Triage &amp; Intelligence Distribution</w:t>
+      </w:r>
+    </w:p>
+    <w:p>
+      <w:pPr>
+        <w:spacing w:after="80" w:line="276" w:lineRule="auto"/>
+      </w:pPr>
+      <w:r>
+        <w:rPr>
+          <w:rFonts w:ascii="Calibri" w:hAnsi="Calibri"/>
+          <w:b/>
+          <w:color w:val="000000"/>
+          <w:sz w:val="20"/>
+        </w:rPr>
+        <w:t xml:space="preserve">Sprint Goal: </w:t>
+      </w:r>
+      <w:r>
+        <w:rPr>
+          <w:rFonts w:ascii="Calibri" w:hAnsi="Calibri"/>
+          <w:color w:val="000000"/>
+          <w:sz w:val="20"/>
+        </w:rPr>
+        <w:t>Implement analyst review, TLP enforcement, STIX distribution, tamper-evident auditing and security monitoring.</w:t>
+      </w:r>
+    </w:p>
+    <w:p>
+      <w:pPr>
+        <w:spacing w:after="80" w:line="276" w:lineRule="auto"/>
+      </w:pPr>
+      <w:r>
+        <w:rPr>
+          <w:rFonts w:ascii="Calibri" w:hAnsi="Calibri"/>
+          <w:color w:val="000000"/>
+          <w:sz w:val="20"/>
+        </w:rPr>
+        <w:t>Completed outcomes:</w:t>
+      </w:r>
+    </w:p>
+    <w:p>
+      <w:pPr>
+        <w:pStyle w:val="ListBullet"/>
+        <w:spacing w:after="60" w:line="276" w:lineRule="auto"/>
+      </w:pPr>
+      <w:r>
+        <w:rPr>
+          <w:rFonts w:ascii="Calibri" w:hAnsi="Calibri"/>
+          <w:color w:val="000000"/>
+          <w:sz w:val="20"/>
+        </w:rPr>
+        <w:t xml:space="preserve"> Analyst triage and review workflow</w:t>
+      </w:r>
+    </w:p>
+    <w:p>
+      <w:pPr>
+        <w:pStyle w:val="ListBullet"/>
+        <w:spacing w:after="60" w:line="276" w:lineRule="auto"/>
+      </w:pPr>
+      <w:r>
+        <w:rPr>
+          <w:rFonts w:ascii="Calibri" w:hAnsi="Calibri"/>
+          <w:color w:val="000000"/>
+          <w:sz w:val="20"/>
+        </w:rPr>
+        <w:t xml:space="preserve"> TLP authorization</w:t>
+      </w:r>
+    </w:p>
+    <w:p>
+      <w:pPr>
+        <w:pStyle w:val="ListBullet"/>
+        <w:spacing w:after="60" w:line="276" w:lineRule="auto"/>
+      </w:pPr>
+      <w:r>
+        <w:rPr>
+          <w:rFonts w:ascii="Calibri" w:hAnsi="Calibri"/>
+          <w:color w:val="000000"/>
+          <w:sz w:val="20"/>
+        </w:rPr>
+        <w:t xml:space="preserve"> Server-side TLP filtering</w:t>
+      </w:r>
+    </w:p>
+    <w:p>
+      <w:pPr>
+        <w:pStyle w:val="ListBullet"/>
+        <w:spacing w:after="60" w:line="276" w:lineRule="auto"/>
+      </w:pPr>
+      <w:r>
+        <w:rPr>
+          <w:rFonts w:ascii="Calibri" w:hAnsi="Calibri"/>
+          <w:color w:val="000000"/>
+          <w:sz w:val="20"/>
+        </w:rPr>
+        <w:t xml:space="preserve"> STIX 2.1 threat feed</w:t>
+      </w:r>
+    </w:p>
+    <w:p>
+      <w:pPr>
+        <w:pStyle w:val="ListBullet"/>
+        <w:spacing w:after="60" w:line="276" w:lineRule="auto"/>
+      </w:pPr>
+      <w:r>
+        <w:rPr>
+          <w:rFonts w:ascii="Calibri" w:hAnsi="Calibri"/>
+          <w:color w:val="000000"/>
+          <w:sz w:val="20"/>
+        </w:rPr>
+        <w:t xml:space="preserve"> Tamper-evident SHA-256 hash-chained audit logging</w:t>
+      </w:r>
+    </w:p>
+    <w:p>
+      <w:pPr>
+        <w:pStyle w:val="ListBullet"/>
+        <w:spacing w:after="60" w:line="276" w:lineRule="auto"/>
+      </w:pPr>
+      <w:r>
+        <w:rPr>
+          <w:rFonts w:ascii="Calibri" w:hAnsi="Calibri"/>
+          <w:color w:val="000000"/>
+          <w:sz w:val="20"/>
+        </w:rPr>
+        <w:t xml:space="preserve"> Audit-chain verification</w:t>
+      </w:r>
+    </w:p>
+    <w:p>
+      <w:pPr>
+        <w:pStyle w:val="ListBullet"/>
+        <w:spacing w:after="60" w:line="276" w:lineRule="auto"/>
+      </w:pPr>
+      <w:r>
+        <w:rPr>
+          <w:rFonts w:ascii="Calibri" w:hAnsi="Calibri"/>
+          <w:color w:val="000000"/>
+          <w:sz w:val="20"/>
+        </w:rPr>
+        <w:t xml:space="preserve"> Prometheus security metrics</w:t>
+      </w:r>
+    </w:p>
+    <w:p>
+      <w:pPr>
+        <w:spacing w:after="80" w:line="276" w:lineRule="auto"/>
+      </w:pPr>
+      <w:r>
+        <w:rPr>
+          <w:rFonts w:ascii="Calibri" w:hAnsi="Calibri"/>
+          <w:b/>
+          <w:color w:val="000000"/>
+          <w:sz w:val="20"/>
+        </w:rPr>
+        <w:t xml:space="preserve">Sprint result: </w:t>
+      </w:r>
+      <w:r>
+        <w:rPr>
+          <w:rFonts w:ascii="Calibri" w:hAnsi="Calibri"/>
+          <w:color w:val="000000"/>
+          <w:sz w:val="20"/>
+        </w:rPr>
+        <w:t>21/21 story points completed.</w:t>
+      </w:r>
+    </w:p>
+    <w:p>
+      <w:pPr>
+        <w:pStyle w:val="Heading2"/>
+        <w:keepNext/>
+        <w:spacing w:before="240" w:after="80"/>
+      </w:pPr>
+      <w:r>
+        <w:rPr>
+          <w:rFonts w:ascii="Calibri" w:hAnsi="Calibri"/>
+          <w:b/>
+          <w:color w:val="000000"/>
+          <w:sz w:val="26"/>
+        </w:rPr>
+        <w:t>10.7 Sprint Retrospective</w:t>
+      </w:r>
+    </w:p>
+    <w:p>
+      <w:pPr>
+        <w:spacing w:after="80" w:line="276" w:lineRule="auto"/>
+      </w:pPr>
+      <w:r>
+        <w:rPr>
+          <w:rFonts w:ascii="Calibri" w:hAnsi="Calibri"/>
+          <w:color w:val="000000"/>
+          <w:sz w:val="20"/>
+        </w:rPr>
+        <w:t>At the conclusion of each sprint, formal retrospectives evaluated process efficiency, engineering hygiene, and security practices:</w:t>
       </w:r>
     </w:p>
     <w:tbl>
@@ -27323,55 +29428,689 @@
         <w:tblW w:type="auto" w:w="0"/>
         <w:jc w:val="center"/>
         <w:tblLook w:firstColumn="1" w:firstRow="1" w:lastColumn="0" w:lastRow="0" w:noHBand="0" w:noVBand="1" w:val="04A0"/>
+        <w:tblBorders>
+          <w:top w:val="single" w:sz="4" w:space="0" w:color="000000"/>
+          <w:bottom w:val="single" w:sz="4" w:space="0" w:color="000000"/>
+          <w:left w:val="none" w:sz="0" w:space="0" w:color="auto"/>
+          <w:right w:val="none" w:sz="0" w:space="0" w:color="auto"/>
+          <w:insideH w:val="single" w:sz="4" w:space="0" w:color="000000"/>
+          <w:insideV w:val="none" w:sz="0" w:space="0" w:color="auto"/>
+        </w:tblBorders>
       </w:tblPr>
       <w:tblGrid>
-        <w:gridCol w:w="8309"/>
+        <w:gridCol w:w="2770"/>
+        <w:gridCol w:w="2770"/>
+        <w:gridCol w:w="2770"/>
       </w:tblGrid>
       <w:tr>
-        <w:tc>
-          <w:tcPr>
-            <w:tcW w:type="dxa" w:w="8309"/>
-            <w:tcMar>
-              <w:top w:w="140" w:type="dxa"/>
-              <w:bottom w:w="140" w:type="dxa"/>
-              <w:left w:w="200" w:type="dxa"/>
-              <w:right w:w="200" w:type="dxa"/>
-            </w:tcMar>
-            <w:tcBorders>
-              <w:top w:val="single" w:sz="4" w:space="0" w:color="auto"/>
-              <w:left w:val="single" w:sz="18" w:space="0" w:color="auto"/>
-              <w:bottom w:val="single" w:sz="4" w:space="0" w:color="auto"/>
-              <w:right w:val="single" w:sz="4" w:space="0" w:color="auto"/>
-            </w:tcBorders>
-          </w:tcPr>
-          <w:p>
-            <w:pPr>
-              <w:spacing w:after="40"/>
-              <w:jc w:val="center"/>
+        <w:trPr>
+          <w:tblHeader/>
+          <w:cantSplit/>
+        </w:trPr>
+        <w:tc>
+          <w:tcPr>
+            <w:tcW w:type="dxa" w:w="2160"/>
+            <w:shd w:fill="F1F5F9"/>
+            <w:tcMar>
+              <w:top w:w="100" w:type="dxa"/>
+              <w:bottom w:w="100" w:type="dxa"/>
+              <w:left w:w="120" w:type="dxa"/>
+              <w:right w:w="120" w:type="dxa"/>
+            </w:tcMar>
+          </w:tcPr>
+          <w:p>
+            <w:pPr>
+              <w:jc w:val="left"/>
             </w:pPr>
             <w:r>
               <w:rPr>
                 <w:rFonts w:ascii="Calibri" w:hAnsi="Calibri"/>
                 <w:b/>
-                <w:sz w:val="19"/>
-              </w:rPr>
-              <w:t>[INSERT ACTUAL JIRA METRIC SCREENSHOT: SPRINT BURNDOWN &amp; VELOCITY CHART]</w:t>
-              <w:br/>
-            </w:r>
-            <w:r>
-              <w:rPr>
-                <w:rFonts w:ascii="Calibri" w:hAnsi="Calibri"/>
-                <w:i/>
-                <w:sz w:val="17"/>
-              </w:rPr>
-              <w:t>Captures the completed Jira Scrum board (all stories in DONE column) and the actual Sprint Burndown showing 0 remaining SP.</w:t>
-              <w:br/>
+                <w:color w:val="000000"/>
+                <w:sz w:val="18"/>
+              </w:rPr>
+              <w:t>Area</w:t>
+            </w:r>
+          </w:p>
+        </w:tc>
+        <w:tc>
+          <w:tcPr>
+            <w:tcW w:type="dxa" w:w="3600"/>
+            <w:shd w:fill="F1F5F9"/>
+            <w:tcMar>
+              <w:top w:w="100" w:type="dxa"/>
+              <w:bottom w:w="100" w:type="dxa"/>
+              <w:left w:w="120" w:type="dxa"/>
+              <w:right w:w="120" w:type="dxa"/>
+            </w:tcMar>
+          </w:tcPr>
+          <w:p>
+            <w:pPr>
+              <w:jc w:val="left"/>
+            </w:pPr>
+            <w:r>
+              <w:rPr>
+                <w:rFonts w:ascii="Calibri" w:hAnsi="Calibri"/>
+                <w:b/>
+                <w:color w:val="000000"/>
+                <w:sz w:val="18"/>
+              </w:rPr>
+              <w:t>Observation</w:t>
+            </w:r>
+          </w:p>
+        </w:tc>
+        <w:tc>
+          <w:tcPr>
+            <w:tcW w:type="dxa" w:w="3600"/>
+            <w:shd w:fill="F1F5F9"/>
+            <w:tcMar>
+              <w:top w:w="100" w:type="dxa"/>
+              <w:bottom w:w="100" w:type="dxa"/>
+              <w:left w:w="120" w:type="dxa"/>
+              <w:right w:w="120" w:type="dxa"/>
+            </w:tcMar>
+          </w:tcPr>
+          <w:p>
+            <w:pPr>
+              <w:jc w:val="left"/>
+            </w:pPr>
+            <w:r>
+              <w:rPr>
+                <w:rFonts w:ascii="Calibri" w:hAnsi="Calibri"/>
+                <w:b/>
+                <w:color w:val="000000"/>
+                <w:sz w:val="18"/>
+              </w:rPr>
+              <w:t>Improvement / Action</w:t>
+            </w:r>
+          </w:p>
+        </w:tc>
+      </w:tr>
+      <w:tr>
+        <w:trPr>
+          <w:cantSplit/>
+        </w:trPr>
+        <w:tc>
+          <w:tcPr>
+            <w:tcW w:type="dxa" w:w="2160"/>
+            <w:shd w:fill="FFFFFF"/>
+            <w:tcMar>
+              <w:top w:w="80" w:type="dxa"/>
+              <w:bottom w:w="80" w:type="dxa"/>
+              <w:left w:w="120" w:type="dxa"/>
+              <w:right w:w="120" w:type="dxa"/>
+            </w:tcMar>
+          </w:tcPr>
+          <w:p>
+            <w:pPr>
+              <w:jc w:val="left"/>
+            </w:pPr>
+            <w:r>
+              <w:rPr>
+                <w:rFonts w:ascii="Calibri" w:hAnsi="Calibri"/>
+                <w:sz w:val="17"/>
+              </w:rPr>
+              <w:t>What went well</w:t>
+            </w:r>
+          </w:p>
+        </w:tc>
+        <w:tc>
+          <w:tcPr>
+            <w:tcW w:type="dxa" w:w="3600"/>
+            <w:shd w:fill="FFFFFF"/>
+            <w:tcMar>
+              <w:top w:w="80" w:type="dxa"/>
+              <w:bottom w:w="80" w:type="dxa"/>
+              <w:left w:w="120" w:type="dxa"/>
+              <w:right w:w="120" w:type="dxa"/>
+            </w:tcMar>
+          </w:tcPr>
+          <w:p>
+            <w:pPr>
+              <w:jc w:val="left"/>
+            </w:pPr>
+            <w:r>
+              <w:rPr>
+                <w:rFonts w:ascii="Calibri" w:hAnsi="Calibri"/>
+                <w:sz w:val="17"/>
+              </w:rPr>
+              <w:t>Security controls were integrated alongside core functionality.</w:t>
+            </w:r>
+          </w:p>
+        </w:tc>
+        <w:tc>
+          <w:tcPr>
+            <w:tcW w:type="dxa" w:w="3600"/>
+            <w:shd w:fill="FFFFFF"/>
+            <w:tcMar>
+              <w:top w:w="80" w:type="dxa"/>
+              <w:bottom w:w="80" w:type="dxa"/>
+              <w:left w:w="120" w:type="dxa"/>
+              <w:right w:w="120" w:type="dxa"/>
+            </w:tcMar>
+          </w:tcPr>
+          <w:p>
+            <w:pPr>
+              <w:jc w:val="left"/>
+            </w:pPr>
+            <w:r>
+              <w:rPr>
+                <w:rFonts w:ascii="Calibri" w:hAnsi="Calibri"/>
+                <w:sz w:val="17"/>
+              </w:rPr>
+              <w:t>Continue security-first implementation.</w:t>
+            </w:r>
+          </w:p>
+        </w:tc>
+      </w:tr>
+      <w:tr>
+        <w:trPr>
+          <w:cantSplit/>
+        </w:trPr>
+        <w:tc>
+          <w:tcPr>
+            <w:tcW w:type="dxa" w:w="2160"/>
+            <w:shd w:fill="F9FAFB"/>
+            <w:tcMar>
+              <w:top w:w="80" w:type="dxa"/>
+              <w:bottom w:w="80" w:type="dxa"/>
+              <w:left w:w="120" w:type="dxa"/>
+              <w:right w:w="120" w:type="dxa"/>
+            </w:tcMar>
+          </w:tcPr>
+          <w:p>
+            <w:pPr>
+              <w:jc w:val="left"/>
+            </w:pPr>
+            <w:r>
+              <w:rPr>
+                <w:rFonts w:ascii="Calibri" w:hAnsi="Calibri"/>
+                <w:sz w:val="17"/>
+              </w:rPr>
+              <w:t>What went well</w:t>
+            </w:r>
+          </w:p>
+        </w:tc>
+        <w:tc>
+          <w:tcPr>
+            <w:tcW w:type="dxa" w:w="3600"/>
+            <w:shd w:fill="F9FAFB"/>
+            <w:tcMar>
+              <w:top w:w="80" w:type="dxa"/>
+              <w:bottom w:w="80" w:type="dxa"/>
+              <w:left w:w="120" w:type="dxa"/>
+              <w:right w:w="120" w:type="dxa"/>
+            </w:tcMar>
+          </w:tcPr>
+          <w:p>
+            <w:pPr>
+              <w:jc w:val="left"/>
+            </w:pPr>
+            <w:r>
+              <w:rPr>
+                <w:rFonts w:ascii="Calibri" w:hAnsi="Calibri"/>
+                <w:sz w:val="17"/>
+              </w:rPr>
+              <w:t>Automated testing provided continuous verification.</w:t>
+            </w:r>
+          </w:p>
+        </w:tc>
+        <w:tc>
+          <w:tcPr>
+            <w:tcW w:type="dxa" w:w="3600"/>
+            <w:shd w:fill="F9FAFB"/>
+            <w:tcMar>
+              <w:top w:w="80" w:type="dxa"/>
+              <w:bottom w:w="80" w:type="dxa"/>
+              <w:left w:w="120" w:type="dxa"/>
+              <w:right w:w="120" w:type="dxa"/>
+            </w:tcMar>
+          </w:tcPr>
+          <w:p>
+            <w:pPr>
+              <w:jc w:val="left"/>
+            </w:pPr>
+            <w:r>
+              <w:rPr>
+                <w:rFonts w:ascii="Calibri" w:hAnsi="Calibri"/>
+                <w:sz w:val="17"/>
+              </w:rPr>
+              <w:t>Maintain regression tests for every security-sensitive feature.</w:t>
+            </w:r>
+          </w:p>
+        </w:tc>
+      </w:tr>
+      <w:tr>
+        <w:trPr>
+          <w:cantSplit/>
+        </w:trPr>
+        <w:tc>
+          <w:tcPr>
+            <w:tcW w:type="dxa" w:w="2160"/>
+            <w:shd w:fill="FFFFFF"/>
+            <w:tcMar>
+              <w:top w:w="80" w:type="dxa"/>
+              <w:bottom w:w="80" w:type="dxa"/>
+              <w:left w:w="120" w:type="dxa"/>
+              <w:right w:w="120" w:type="dxa"/>
+            </w:tcMar>
+          </w:tcPr>
+          <w:p>
+            <w:pPr>
+              <w:jc w:val="left"/>
+            </w:pPr>
+            <w:r>
+              <w:rPr>
+                <w:rFonts w:ascii="Calibri" w:hAnsi="Calibri"/>
+                <w:sz w:val="17"/>
+              </w:rPr>
+              <w:t>What went well</w:t>
+            </w:r>
+          </w:p>
+        </w:tc>
+        <w:tc>
+          <w:tcPr>
+            <w:tcW w:type="dxa" w:w="3600"/>
+            <w:shd w:fill="FFFFFF"/>
+            <w:tcMar>
+              <w:top w:w="80" w:type="dxa"/>
+              <w:bottom w:w="80" w:type="dxa"/>
+              <w:left w:w="120" w:type="dxa"/>
+              <w:right w:w="120" w:type="dxa"/>
+            </w:tcMar>
+          </w:tcPr>
+          <w:p>
+            <w:pPr>
+              <w:jc w:val="left"/>
+            </w:pPr>
+            <w:r>
+              <w:rPr>
+                <w:rFonts w:ascii="Calibri" w:hAnsi="Calibri"/>
+                <w:sz w:val="17"/>
+              </w:rPr>
+              <w:t>Both sprint commitments were completed.</w:t>
+            </w:r>
+          </w:p>
+        </w:tc>
+        <w:tc>
+          <w:tcPr>
+            <w:tcW w:type="dxa" w:w="3600"/>
+            <w:shd w:fill="FFFFFF"/>
+            <w:tcMar>
+              <w:top w:w="80" w:type="dxa"/>
+              <w:bottom w:w="80" w:type="dxa"/>
+              <w:left w:w="120" w:type="dxa"/>
+              <w:right w:w="120" w:type="dxa"/>
+            </w:tcMar>
+          </w:tcPr>
+          <w:p>
+            <w:pPr>
+              <w:jc w:val="left"/>
+            </w:pPr>
+            <w:r>
+              <w:rPr>
+                <w:rFonts w:ascii="Calibri" w:hAnsi="Calibri"/>
+                <w:sz w:val="17"/>
+              </w:rPr>
+              <w:t>Continue using realistic story-point estimates.</w:t>
+            </w:r>
+          </w:p>
+        </w:tc>
+      </w:tr>
+      <w:tr>
+        <w:trPr>
+          <w:cantSplit/>
+        </w:trPr>
+        <w:tc>
+          <w:tcPr>
+            <w:tcW w:type="dxa" w:w="2160"/>
+            <w:shd w:fill="F9FAFB"/>
+            <w:tcMar>
+              <w:top w:w="80" w:type="dxa"/>
+              <w:bottom w:w="80" w:type="dxa"/>
+              <w:left w:w="120" w:type="dxa"/>
+              <w:right w:w="120" w:type="dxa"/>
+            </w:tcMar>
+          </w:tcPr>
+          <w:p>
+            <w:pPr>
+              <w:jc w:val="left"/>
+            </w:pPr>
+            <w:r>
+              <w:rPr>
+                <w:rFonts w:ascii="Calibri" w:hAnsi="Calibri"/>
+                <w:sz w:val="17"/>
+              </w:rPr>
+              <w:t>What could improve</w:t>
+            </w:r>
+          </w:p>
+        </w:tc>
+        <w:tc>
+          <w:tcPr>
+            <w:tcW w:type="dxa" w:w="3600"/>
+            <w:shd w:fill="F9FAFB"/>
+            <w:tcMar>
+              <w:top w:w="80" w:type="dxa"/>
+              <w:bottom w:w="80" w:type="dxa"/>
+              <w:left w:w="120" w:type="dxa"/>
+              <w:right w:w="120" w:type="dxa"/>
+            </w:tcMar>
+          </w:tcPr>
+          <w:p>
+            <w:pPr>
+              <w:jc w:val="left"/>
+            </w:pPr>
+            <w:r>
+              <w:rPr>
+                <w:rFonts w:ascii="Calibri" w:hAnsi="Calibri"/>
+                <w:sz w:val="17"/>
+              </w:rPr>
+              <w:t>Documentation and diagrams required repeated consistency checks.</w:t>
+            </w:r>
+          </w:p>
+        </w:tc>
+        <w:tc>
+          <w:tcPr>
+            <w:tcW w:type="dxa" w:w="3600"/>
+            <w:shd w:fill="F9FAFB"/>
+            <w:tcMar>
+              <w:top w:w="80" w:type="dxa"/>
+              <w:bottom w:w="80" w:type="dxa"/>
+              <w:left w:w="120" w:type="dxa"/>
+              <w:right w:w="120" w:type="dxa"/>
+            </w:tcMar>
+          </w:tcPr>
+          <w:p>
+            <w:pPr>
+              <w:jc w:val="left"/>
+            </w:pPr>
+            <w:r>
+              <w:rPr>
+                <w:rFonts w:ascii="Calibri" w:hAnsi="Calibri"/>
+                <w:sz w:val="17"/>
+              </w:rPr>
+              <w:t>Update traceability and diagrams immediately when architecture changes.</w:t>
+            </w:r>
+          </w:p>
+        </w:tc>
+      </w:tr>
+      <w:tr>
+        <w:trPr>
+          <w:cantSplit/>
+        </w:trPr>
+        <w:tc>
+          <w:tcPr>
+            <w:tcW w:type="dxa" w:w="2160"/>
+            <w:shd w:fill="FFFFFF"/>
+            <w:tcMar>
+              <w:top w:w="80" w:type="dxa"/>
+              <w:bottom w:w="80" w:type="dxa"/>
+              <w:left w:w="120" w:type="dxa"/>
+              <w:right w:w="120" w:type="dxa"/>
+            </w:tcMar>
+          </w:tcPr>
+          <w:p>
+            <w:pPr>
+              <w:jc w:val="left"/>
+            </w:pPr>
+            <w:r>
+              <w:rPr>
+                <w:rFonts w:ascii="Calibri" w:hAnsi="Calibri"/>
+                <w:sz w:val="17"/>
+              </w:rPr>
+              <w:t>What could improve</w:t>
+            </w:r>
+          </w:p>
+        </w:tc>
+        <w:tc>
+          <w:tcPr>
+            <w:tcW w:type="dxa" w:w="3600"/>
+            <w:shd w:fill="FFFFFF"/>
+            <w:tcMar>
+              <w:top w:w="80" w:type="dxa"/>
+              <w:bottom w:w="80" w:type="dxa"/>
+              <w:left w:w="120" w:type="dxa"/>
+              <w:right w:w="120" w:type="dxa"/>
+            </w:tcMar>
+          </w:tcPr>
+          <w:p>
+            <w:pPr>
+              <w:jc w:val="left"/>
+            </w:pPr>
+            <w:r>
+              <w:rPr>
+                <w:rFonts w:ascii="Calibri" w:hAnsi="Calibri"/>
+                <w:sz w:val="17"/>
+              </w:rPr>
+              <w:t>Evidence collection was concentrated toward the end.</w:t>
+            </w:r>
+          </w:p>
+        </w:tc>
+        <w:tc>
+          <w:tcPr>
+            <w:tcW w:type="dxa" w:w="3600"/>
+            <w:shd w:fill="FFFFFF"/>
+            <w:tcMar>
+              <w:top w:w="80" w:type="dxa"/>
+              <w:bottom w:w="80" w:type="dxa"/>
+              <w:left w:w="120" w:type="dxa"/>
+              <w:right w:w="120" w:type="dxa"/>
+            </w:tcMar>
+          </w:tcPr>
+          <w:p>
+            <w:pPr>
+              <w:jc w:val="left"/>
+            </w:pPr>
+            <w:r>
+              <w:rPr>
+                <w:rFonts w:ascii="Calibri" w:hAnsi="Calibri"/>
+                <w:sz w:val="17"/>
+              </w:rPr>
+              <w:t>Capture implementation and testing evidence immediately after each task.</w:t>
+            </w:r>
+          </w:p>
+        </w:tc>
+      </w:tr>
+      <w:tr>
+        <w:trPr>
+          <w:cantSplit/>
+        </w:trPr>
+        <w:tc>
+          <w:tcPr>
+            <w:tcW w:type="dxa" w:w="2160"/>
+            <w:shd w:fill="F9FAFB"/>
+            <w:tcMar>
+              <w:top w:w="80" w:type="dxa"/>
+              <w:bottom w:w="80" w:type="dxa"/>
+              <w:left w:w="120" w:type="dxa"/>
+              <w:right w:w="120" w:type="dxa"/>
+            </w:tcMar>
+          </w:tcPr>
+          <w:p>
+            <w:pPr>
+              <w:jc w:val="left"/>
+            </w:pPr>
+            <w:r>
+              <w:rPr>
+                <w:rFonts w:ascii="Calibri" w:hAnsi="Calibri"/>
+                <w:sz w:val="17"/>
+              </w:rPr>
+              <w:t>What could improve</w:t>
+            </w:r>
+          </w:p>
+        </w:tc>
+        <w:tc>
+          <w:tcPr>
+            <w:tcW w:type="dxa" w:w="3600"/>
+            <w:shd w:fill="F9FAFB"/>
+            <w:tcMar>
+              <w:top w:w="80" w:type="dxa"/>
+              <w:bottom w:w="80" w:type="dxa"/>
+              <w:left w:w="120" w:type="dxa"/>
+              <w:right w:w="120" w:type="dxa"/>
+            </w:tcMar>
+          </w:tcPr>
+          <w:p>
+            <w:pPr>
+              <w:jc w:val="left"/>
+            </w:pPr>
+            <w:r>
+              <w:rPr>
+                <w:rFonts w:ascii="Calibri" w:hAnsi="Calibri"/>
+                <w:sz w:val="17"/>
+              </w:rPr>
+              <w:t>Some security requirements required clarification during implementation.</w:t>
+            </w:r>
+          </w:p>
+        </w:tc>
+        <w:tc>
+          <w:tcPr>
+            <w:tcW w:type="dxa" w:w="3600"/>
+            <w:shd w:fill="F9FAFB"/>
+            <w:tcMar>
+              <w:top w:w="80" w:type="dxa"/>
+              <w:bottom w:w="80" w:type="dxa"/>
+              <w:left w:w="120" w:type="dxa"/>
+              <w:right w:w="120" w:type="dxa"/>
+            </w:tcMar>
+          </w:tcPr>
+          <w:p>
+            <w:pPr>
+              <w:jc w:val="left"/>
+            </w:pPr>
+            <w:r>
+              <w:rPr>
+                <w:rFonts w:ascii="Calibri" w:hAnsi="Calibri"/>
+                <w:sz w:val="17"/>
+              </w:rPr>
+              <w:t>Refine acceptance criteria before sprint execution.</w:t>
             </w:r>
           </w:p>
         </w:tc>
       </w:tr>
     </w:tbl>
     <w:p/>
+    <w:p>
+      <w:pPr>
+        <w:pStyle w:val="Heading2"/>
+        <w:keepNext/>
+        <w:spacing w:before="240" w:after="80"/>
+      </w:pPr>
+      <w:r>
+        <w:rPr>
+          <w:rFonts w:ascii="Calibri" w:hAnsi="Calibri"/>
+          <w:b/>
+          <w:color w:val="000000"/>
+          <w:sz w:val="26"/>
+        </w:rPr>
+        <w:t>10.8 Retrospective Action Items</w:t>
+      </w:r>
+    </w:p>
+    <w:p>
+      <w:pPr>
+        <w:spacing w:after="80" w:line="276" w:lineRule="auto"/>
+      </w:pPr>
+      <w:r>
+        <w:rPr>
+          <w:rFonts w:ascii="Calibri" w:hAnsi="Calibri"/>
+          <w:color w:val="000000"/>
+          <w:sz w:val="20"/>
+        </w:rPr>
+        <w:t>The team committed to the following continuous improvement actions for subsequent engineering milestones:</w:t>
+      </w:r>
+    </w:p>
+    <w:p>
+      <w:pPr>
+        <w:pStyle w:val="ListBullet"/>
+        <w:spacing w:after="60" w:line="276" w:lineRule="auto"/>
+      </w:pPr>
+      <w:r>
+        <w:rPr>
+          <w:rFonts w:ascii="Calibri" w:hAnsi="Calibri"/>
+          <w:b/>
+          <w:color w:val="000000"/>
+          <w:sz w:val="20"/>
+        </w:rPr>
+        <w:t xml:space="preserve">1. </w:t>
+      </w:r>
+      <w:r>
+        <w:rPr>
+          <w:rFonts w:ascii="Calibri" w:hAnsi="Calibri"/>
+          <w:color w:val="000000"/>
+          <w:sz w:val="20"/>
+        </w:rPr>
+        <w:t xml:space="preserve"> Maintain the requirements → design → implementation → test → evidence traceability continuously.</w:t>
+      </w:r>
+    </w:p>
+    <w:p>
+      <w:pPr>
+        <w:pStyle w:val="ListBullet"/>
+        <w:spacing w:after="60" w:line="276" w:lineRule="auto"/>
+      </w:pPr>
+      <w:r>
+        <w:rPr>
+          <w:rFonts w:ascii="Calibri" w:hAnsi="Calibri"/>
+          <w:b/>
+          <w:color w:val="000000"/>
+          <w:sz w:val="20"/>
+        </w:rPr>
+        <w:t xml:space="preserve">2. </w:t>
+      </w:r>
+      <w:r>
+        <w:rPr>
+          <w:rFonts w:ascii="Calibri" w:hAnsi="Calibri"/>
+          <w:color w:val="000000"/>
+          <w:sz w:val="20"/>
+        </w:rPr>
+        <w:t xml:space="preserve"> Capture screenshots and test evidence immediately after completing each sprint item.</w:t>
+      </w:r>
+    </w:p>
+    <w:p>
+      <w:pPr>
+        <w:pStyle w:val="ListBullet"/>
+        <w:spacing w:after="60" w:line="276" w:lineRule="auto"/>
+      </w:pPr>
+      <w:r>
+        <w:rPr>
+          <w:rFonts w:ascii="Calibri" w:hAnsi="Calibri"/>
+          <w:b/>
+          <w:color w:val="000000"/>
+          <w:sz w:val="20"/>
+        </w:rPr>
+        <w:t xml:space="preserve">3. </w:t>
+      </w:r>
+      <w:r>
+        <w:rPr>
+          <w:rFonts w:ascii="Calibri" w:hAnsi="Calibri"/>
+          <w:color w:val="000000"/>
+          <w:sz w:val="20"/>
+        </w:rPr>
+        <w:t xml:space="preserve"> Keep security regression tests alongside security-sensitive implementation changes.</w:t>
+      </w:r>
+    </w:p>
+    <w:p>
+      <w:pPr>
+        <w:pStyle w:val="ListBullet"/>
+        <w:spacing w:after="60" w:line="276" w:lineRule="auto"/>
+      </w:pPr>
+      <w:r>
+        <w:rPr>
+          <w:rFonts w:ascii="Calibri" w:hAnsi="Calibri"/>
+          <w:b/>
+          <w:color w:val="000000"/>
+          <w:sz w:val="20"/>
+        </w:rPr>
+        <w:t xml:space="preserve">4. </w:t>
+      </w:r>
+      <w:r>
+        <w:rPr>
+          <w:rFonts w:ascii="Calibri" w:hAnsi="Calibri"/>
+          <w:color w:val="000000"/>
+          <w:sz w:val="20"/>
+        </w:rPr>
+        <w:t xml:space="preserve"> Validate architecture and threat-model consistency whenever a security control changes.</w:t>
+      </w:r>
+    </w:p>
     <w:p>
       <w:r>
         <w:br w:type="page"/>
@@ -27443,6 +30182,10 @@
         <w:gridCol w:w="2077"/>
       </w:tblGrid>
       <w:tr>
+        <w:trPr>
+          <w:tblHeader/>
+          <w:cantSplit/>
+        </w:trPr>
         <w:tc>
           <w:tcPr>
             <w:tcW w:type="dxa" w:w="864"/>
@@ -27549,6 +30292,9 @@
         </w:tc>
       </w:tr>
       <w:tr>
+        <w:trPr>
+          <w:cantSplit/>
+        </w:trPr>
         <w:tc>
           <w:tcPr>
             <w:tcW w:type="dxa" w:w="864"/>
@@ -27647,6 +30393,9 @@
         </w:tc>
       </w:tr>
       <w:tr>
+        <w:trPr>
+          <w:cantSplit/>
+        </w:trPr>
         <w:tc>
           <w:tcPr>
             <w:tcW w:type="dxa" w:w="864"/>
@@ -27745,6 +30494,9 @@
         </w:tc>
       </w:tr>
       <w:tr>
+        <w:trPr>
+          <w:cantSplit/>
+        </w:trPr>
         <w:tc>
           <w:tcPr>
             <w:tcW w:type="dxa" w:w="864"/>
@@ -27843,6 +30595,9 @@
         </w:tc>
       </w:tr>
       <w:tr>
+        <w:trPr>
+          <w:cantSplit/>
+        </w:trPr>
         <w:tc>
           <w:tcPr>
             <w:tcW w:type="dxa" w:w="864"/>
@@ -27941,6 +30696,9 @@
         </w:tc>
       </w:tr>
       <w:tr>
+        <w:trPr>
+          <w:cantSplit/>
+        </w:trPr>
         <w:tc>
           <w:tcPr>
             <w:tcW w:type="dxa" w:w="864"/>
@@ -28039,6 +30797,9 @@
         </w:tc>
       </w:tr>
       <w:tr>
+        <w:trPr>
+          <w:cantSplit/>
+        </w:trPr>
         <w:tc>
           <w:tcPr>
             <w:tcW w:type="dxa" w:w="864"/>
@@ -28137,6 +30898,9 @@
         </w:tc>
       </w:tr>
       <w:tr>
+        <w:trPr>
+          <w:cantSplit/>
+        </w:trPr>
         <w:tc>
           <w:tcPr>
             <w:tcW w:type="dxa" w:w="864"/>
@@ -28235,6 +30999,9 @@
         </w:tc>
       </w:tr>
       <w:tr>
+        <w:trPr>
+          <w:cantSplit/>
+        </w:trPr>
         <w:tc>
           <w:tcPr>
             <w:tcW w:type="dxa" w:w="864"/>
@@ -28333,6 +31100,9 @@
         </w:tc>
       </w:tr>
       <w:tr>
+        <w:trPr>
+          <w:cantSplit/>
+        </w:trPr>
         <w:tc>
           <w:tcPr>
             <w:tcW w:type="dxa" w:w="864"/>
@@ -28431,6 +31201,9 @@
         </w:tc>
       </w:tr>
       <w:tr>
+        <w:trPr>
+          <w:cantSplit/>
+        </w:trPr>
         <w:tc>
           <w:tcPr>
             <w:tcW w:type="dxa" w:w="864"/>
@@ -28529,6 +31302,9 @@
         </w:tc>
       </w:tr>
       <w:tr>
+        <w:trPr>
+          <w:cantSplit/>
+        </w:trPr>
         <w:tc>
           <w:tcPr>
             <w:tcW w:type="dxa" w:w="864"/>
@@ -28671,6 +31447,10 @@
         <w:gridCol w:w="831"/>
       </w:tblGrid>
       <w:tr>
+        <w:trPr>
+          <w:tblHeader/>
+          <w:cantSplit/>
+        </w:trPr>
         <w:tc>
           <w:tcPr>
             <w:tcW w:type="dxa" w:w="864"/>
@@ -28933,6 +31713,9 @@
         </w:tc>
       </w:tr>
       <w:tr>
+        <w:trPr>
+          <w:cantSplit/>
+        </w:trPr>
         <w:tc>
           <w:tcPr>
             <w:tcW w:type="dxa" w:w="864"/>
@@ -29175,6 +31958,9 @@
         </w:tc>
       </w:tr>
       <w:tr>
+        <w:trPr>
+          <w:cantSplit/>
+        </w:trPr>
         <w:tc>
           <w:tcPr>
             <w:tcW w:type="dxa" w:w="864"/>
@@ -29417,6 +32203,9 @@
         </w:tc>
       </w:tr>
       <w:tr>
+        <w:trPr>
+          <w:cantSplit/>
+        </w:trPr>
         <w:tc>
           <w:tcPr>
             <w:tcW w:type="dxa" w:w="864"/>
@@ -29659,6 +32448,9 @@
         </w:tc>
       </w:tr>
       <w:tr>
+        <w:trPr>
+          <w:cantSplit/>
+        </w:trPr>
         <w:tc>
           <w:tcPr>
             <w:tcW w:type="dxa" w:w="864"/>
@@ -29901,6 +32693,9 @@
         </w:tc>
       </w:tr>
       <w:tr>
+        <w:trPr>
+          <w:cantSplit/>
+        </w:trPr>
         <w:tc>
           <w:tcPr>
             <w:tcW w:type="dxa" w:w="864"/>
@@ -30143,6 +32938,9 @@
         </w:tc>
       </w:tr>
       <w:tr>
+        <w:trPr>
+          <w:cantSplit/>
+        </w:trPr>
         <w:tc>
           <w:tcPr>
             <w:tcW w:type="dxa" w:w="864"/>
@@ -30385,6 +33183,9 @@
         </w:tc>
       </w:tr>
       <w:tr>
+        <w:trPr>
+          <w:cantSplit/>
+        </w:trPr>
         <w:tc>
           <w:tcPr>
             <w:tcW w:type="dxa" w:w="864"/>
@@ -30627,6 +33428,9 @@
         </w:tc>
       </w:tr>
       <w:tr>
+        <w:trPr>
+          <w:cantSplit/>
+        </w:trPr>
         <w:tc>
           <w:tcPr>
             <w:tcW w:type="dxa" w:w="864"/>
@@ -30869,6 +33673,9 @@
         </w:tc>
       </w:tr>
       <w:tr>
+        <w:trPr>
+          <w:cantSplit/>
+        </w:trPr>
         <w:tc>
           <w:tcPr>
             <w:tcW w:type="dxa" w:w="864"/>

</xml_diff>